<commit_message>
Culminación del documento de entrega número 1
</commit_message>
<xml_diff>
--- a/Documentos/DesarrolloEntrega1.docx
+++ b/Documentos/DesarrolloEntrega1.docx
@@ -6,16 +6,33 @@
       <w:pPr>
         <w:spacing w:after="40"/>
         <w:jc w:val="center"/>
-      </w:pPr>
-      <w:r>
         <w:rPr>
           <w:b/>
           <w:bCs/>
           <w:color w:val="1A1A2E"/>
-          <w:sz w:val="32"/>
-          <w:szCs w:val="32"/>
-        </w:rPr>
-        <w:t>Primera Entrega: Desarrollo de Caso Final</w:t>
+          <w:sz w:val="28"/>
+          <w:szCs w:val="28"/>
+        </w:rPr>
+      </w:pPr>
+      <w:r>
+        <w:rPr>
+          <w:b/>
+          <w:bCs/>
+          <w:color w:val="1A1A2E"/>
+          <w:sz w:val="28"/>
+          <w:szCs w:val="28"/>
+        </w:rPr>
+        <w:t xml:space="preserve">Informe Ejecutivo: </w:t>
+      </w:r>
+      <w:r>
+        <w:rPr>
+          <w:b/>
+          <w:bCs/>
+          <w:color w:val="1A1A2E"/>
+          <w:sz w:val="28"/>
+          <w:szCs w:val="28"/>
+        </w:rPr>
+        <w:t>Dinámica de Precios de Alimentos Básicos en Colombia (2020–2024): Tendencias, Disparidades Regionales y Factores Económicos</w:t>
       </w:r>
     </w:p>
     <w:p>
@@ -25,7 +42,6 @@
           <w:color w:val="666666"/>
           <w:sz w:val="19"/>
           <w:szCs w:val="19"/>
-          <w:lang w:val="es-ES"/>
         </w:rPr>
       </w:pPr>
       <w:r>
@@ -33,84 +49,96 @@
           <w:color w:val="666666"/>
           <w:sz w:val="19"/>
           <w:szCs w:val="19"/>
-          <w:lang w:val="es-ES"/>
         </w:rPr>
         <w:t>Elaborado por:</w:t>
       </w:r>
     </w:p>
     <w:p>
       <w:pPr>
+        <w:pStyle w:val="Prrafodelista"/>
+        <w:numPr>
+          <w:ilvl w:val="0"/>
+          <w:numId w:val="5"/>
+        </w:numPr>
         <w:spacing w:after="40"/>
         <w:rPr>
           <w:color w:val="666666"/>
           <w:sz w:val="19"/>
           <w:szCs w:val="19"/>
-          <w:lang w:val="es-ES"/>
-        </w:rPr>
-      </w:pPr>
-    </w:p>
-    <w:p>
-      <w:pPr>
-        <w:spacing w:after="40"/>
+        </w:rPr>
+      </w:pPr>
+      <w:r>
         <w:rPr>
           <w:color w:val="666666"/>
           <w:sz w:val="19"/>
           <w:szCs w:val="19"/>
-          <w:lang w:val="es-ES"/>
-        </w:rPr>
-      </w:pPr>
+        </w:rPr>
+        <w:t>Esteban Arroya</w:t>
+      </w:r>
       <w:r>
         <w:rPr>
           <w:color w:val="666666"/>
           <w:sz w:val="19"/>
           <w:szCs w:val="19"/>
         </w:rPr>
-        <w:t>Esteban Arroya</w:t>
+        <w:t>ve López</w:t>
       </w:r>
       <w:r>
         <w:rPr>
           <w:color w:val="666666"/>
           <w:sz w:val="19"/>
           <w:szCs w:val="19"/>
-          <w:lang w:val="es-ES"/>
-        </w:rPr>
-        <w:t>ve López</w:t>
-      </w:r>
+        </w:rPr>
+        <w:t xml:space="preserve">, </w:t>
+      </w:r>
+    </w:p>
+    <w:p>
+      <w:pPr>
+        <w:pStyle w:val="Prrafodelista"/>
+        <w:numPr>
+          <w:ilvl w:val="0"/>
+          <w:numId w:val="5"/>
+        </w:numPr>
+        <w:spacing w:after="40"/>
+      </w:pPr>
       <w:r>
         <w:rPr>
           <w:color w:val="666666"/>
           <w:sz w:val="19"/>
           <w:szCs w:val="19"/>
         </w:rPr>
-        <w:t xml:space="preserve">, </w:t>
-      </w:r>
-    </w:p>
-    <w:p>
-      <w:pPr>
-        <w:spacing w:after="40"/>
+        <w:t>Manuel Luna Alegría</w:t>
+      </w:r>
+      <w:r>
         <w:rPr>
           <w:color w:val="666666"/>
           <w:sz w:val="19"/>
           <w:szCs w:val="19"/>
-          <w:lang w:val="es-ES"/>
-        </w:rPr>
-      </w:pPr>
-      <w:r>
+        </w:rPr>
+        <w:t>,</w:t>
+      </w:r>
+    </w:p>
+    <w:p>
+      <w:pPr>
+        <w:pStyle w:val="Prrafodelista"/>
+        <w:numPr>
+          <w:ilvl w:val="0"/>
+          <w:numId w:val="5"/>
+        </w:numPr>
+        <w:spacing w:after="40"/>
         <w:rPr>
           <w:color w:val="666666"/>
           <w:sz w:val="19"/>
           <w:szCs w:val="19"/>
         </w:rPr>
-        <w:t>Nicol Sinisterra</w:t>
-      </w:r>
+      </w:pPr>
       <w:r>
         <w:rPr>
           <w:color w:val="666666"/>
           <w:sz w:val="19"/>
           <w:szCs w:val="19"/>
-          <w:lang w:val="es-ES"/>
-        </w:rPr>
-        <w:t xml:space="preserve"> Gutiérrez</w:t>
+        </w:rPr>
+        <w:t>Nicol Sinisterra</w:t>
       </w:r>
       <w:r>
         <w:rPr>
@@ -118,125 +146,283 @@
           <w:sz w:val="19"/>
           <w:szCs w:val="19"/>
         </w:rPr>
-        <w:t xml:space="preserve">, </w:t>
+        <w:t xml:space="preserve"> Gutiérrez</w:t>
       </w:r>
     </w:p>
     <w:p>
       <w:pPr>
-        <w:spacing w:after="40"/>
-      </w:pPr>
-      <w:r>
-        <w:rPr>
-          <w:color w:val="666666"/>
-          <w:sz w:val="19"/>
-          <w:szCs w:val="19"/>
-        </w:rPr>
-        <w:t xml:space="preserve">Manuel Luna Alegria  </w:t>
+        <w:pStyle w:val="Ttulo1"/>
+      </w:pPr>
+      <w:r>
+        <w:t>1. Pregunta de Negoci</w:t>
+      </w:r>
+      <w:r>
+        <w:t>o</w:t>
       </w:r>
     </w:p>
     <w:p>
       <w:pPr>
-        <w:pStyle w:val="Ttulo1"/>
-      </w:pPr>
-      <w:r>
-        <w:t>1. Pregunta de Negoci</w:t>
-      </w:r>
-      <w:r>
-        <w:t>o</w:t>
+        <w:spacing w:after="120"/>
+        <w:jc w:val="both"/>
+        <w:rPr>
+          <w:sz w:val="22"/>
+          <w:szCs w:val="22"/>
+        </w:rPr>
+      </w:pPr>
+      <w:r>
+        <w:rPr>
+          <w:b/>
+          <w:bCs/>
+          <w:sz w:val="22"/>
+          <w:szCs w:val="22"/>
+        </w:rPr>
+        <w:t xml:space="preserve">¿Como han evolucionado los precios de los alimentos </w:t>
+      </w:r>
+      <w:r>
+        <w:rPr>
+          <w:b/>
+          <w:bCs/>
+          <w:sz w:val="22"/>
+          <w:szCs w:val="22"/>
+        </w:rPr>
+        <w:t>básicos</w:t>
+      </w:r>
+      <w:r>
+        <w:rPr>
+          <w:b/>
+          <w:bCs/>
+          <w:sz w:val="22"/>
+          <w:szCs w:val="22"/>
+        </w:rPr>
+        <w:t xml:space="preserve"> en los principales mercados de Colombia durante los </w:t>
+      </w:r>
+      <w:r>
+        <w:rPr>
+          <w:b/>
+          <w:bCs/>
+          <w:sz w:val="22"/>
+          <w:szCs w:val="22"/>
+        </w:rPr>
+        <w:t>últimos</w:t>
+      </w:r>
+      <w:r>
+        <w:rPr>
+          <w:b/>
+          <w:bCs/>
+          <w:sz w:val="22"/>
+          <w:szCs w:val="22"/>
+        </w:rPr>
+        <w:t xml:space="preserve"> 25 </w:t>
+      </w:r>
+      <w:r>
+        <w:rPr>
+          <w:b/>
+          <w:bCs/>
+          <w:sz w:val="22"/>
+          <w:szCs w:val="22"/>
+        </w:rPr>
+        <w:t>años</w:t>
+      </w:r>
+      <w:r>
+        <w:rPr>
+          <w:b/>
+          <w:bCs/>
+          <w:sz w:val="22"/>
+          <w:szCs w:val="22"/>
+        </w:rPr>
+        <w:t xml:space="preserve">, y que patrones </w:t>
+      </w:r>
+      <w:r>
+        <w:rPr>
+          <w:b/>
+          <w:bCs/>
+          <w:sz w:val="22"/>
+          <w:szCs w:val="22"/>
+        </w:rPr>
+        <w:t>geográficos</w:t>
+      </w:r>
+      <w:r>
+        <w:rPr>
+          <w:b/>
+          <w:bCs/>
+          <w:sz w:val="22"/>
+          <w:szCs w:val="22"/>
+        </w:rPr>
+        <w:t xml:space="preserve"> y estacionales pueden orientar las decisiones de </w:t>
+      </w:r>
+      <w:r>
+        <w:rPr>
+          <w:b/>
+          <w:bCs/>
+          <w:sz w:val="22"/>
+          <w:szCs w:val="22"/>
+        </w:rPr>
+        <w:t>política</w:t>
+      </w:r>
+      <w:r>
+        <w:rPr>
+          <w:b/>
+          <w:bCs/>
+          <w:sz w:val="22"/>
+          <w:szCs w:val="22"/>
+        </w:rPr>
+        <w:t xml:space="preserve"> publica en seguridad alimentaria?</w:t>
       </w:r>
     </w:p>
     <w:p>
       <w:pPr>
         <w:spacing w:after="120"/>
         <w:jc w:val="both"/>
-      </w:pPr>
-      <w:r>
-        <w:rPr>
-          <w:b/>
-          <w:bCs/>
-        </w:rPr>
-        <w:t>¿Como han evolucionado los precios de los alimentos basicos en los principales mercados de Colombia durante los ultimos 25 anos, y que patrones geograficos y estacionales pueden orientar las decisiones de politica publica en seguridad alimentaria?</w:t>
+        <w:rPr>
+          <w:sz w:val="22"/>
+          <w:szCs w:val="22"/>
+        </w:rPr>
+      </w:pPr>
+      <w:r>
+        <w:rPr>
+          <w:sz w:val="22"/>
+          <w:szCs w:val="22"/>
+        </w:rPr>
+        <w:t xml:space="preserve">Esta pregunta busca identificar, mediante </w:t>
+      </w:r>
+      <w:r>
+        <w:rPr>
+          <w:sz w:val="22"/>
+          <w:szCs w:val="22"/>
+        </w:rPr>
+        <w:t>analítica</w:t>
+      </w:r>
+      <w:r>
+        <w:rPr>
+          <w:sz w:val="22"/>
+          <w:szCs w:val="22"/>
+        </w:rPr>
+        <w:t xml:space="preserve"> visual, las </w:t>
+      </w:r>
+      <w:r>
+        <w:rPr>
+          <w:sz w:val="22"/>
+          <w:szCs w:val="22"/>
+        </w:rPr>
+        <w:t>dinámicas</w:t>
+      </w:r>
+      <w:r>
+        <w:rPr>
+          <w:sz w:val="22"/>
+          <w:szCs w:val="22"/>
+        </w:rPr>
+        <w:t xml:space="preserve"> de precios de alimentos esenciales (cereales, </w:t>
+      </w:r>
+      <w:r>
+        <w:rPr>
+          <w:sz w:val="22"/>
+          <w:szCs w:val="22"/>
+        </w:rPr>
+        <w:t>tubérculos</w:t>
+      </w:r>
+      <w:r>
+        <w:rPr>
+          <w:sz w:val="22"/>
+          <w:szCs w:val="22"/>
+        </w:rPr>
+        <w:t xml:space="preserve">, carnes, </w:t>
+      </w:r>
+      <w:r>
+        <w:rPr>
+          <w:sz w:val="22"/>
+          <w:szCs w:val="22"/>
+        </w:rPr>
+        <w:t>lácteos</w:t>
+      </w:r>
+      <w:r>
+        <w:rPr>
+          <w:sz w:val="22"/>
+          <w:szCs w:val="22"/>
+        </w:rPr>
+        <w:t xml:space="preserve">, frutas y verduras) a nivel departamental y de mercado, permitiendo a los tomadores de decisiones anticipar periodos </w:t>
+      </w:r>
+      <w:r>
+        <w:rPr>
+          <w:sz w:val="22"/>
+          <w:szCs w:val="22"/>
+        </w:rPr>
+        <w:t>de vulnerabilidad</w:t>
+      </w:r>
+      <w:r>
+        <w:rPr>
+          <w:sz w:val="22"/>
+          <w:szCs w:val="22"/>
+        </w:rPr>
+        <w:t xml:space="preserve"> alimentaria y focalizar intervenciones.</w:t>
       </w:r>
     </w:p>
     <w:p>
       <w:pPr>
-        <w:spacing w:after="120"/>
-        <w:jc w:val="both"/>
-      </w:pPr>
-      <w:r>
-        <w:rPr>
-          <w:sz w:val="19"/>
-          <w:szCs w:val="19"/>
-        </w:rPr>
-        <w:t>Esta pregunta busca identificar, mediante analitica visual, las dinamicas de precios de alimentos esenciales (cereales, tuberculos, carnes, lacteos, frutas y verduras) a nivel departamental y de mercado, permitiendo a los tomadores de decisiones anticipar periodos devulnerabilidad alimentaria y focalizar intervenciones.</w:t>
+        <w:pStyle w:val="Ttulo1"/>
+      </w:pPr>
+      <w:r>
+        <w:t>2. Contexto Organizacional</w:t>
       </w:r>
     </w:p>
     <w:p>
       <w:pPr>
-        <w:pStyle w:val="Ttulo1"/>
-      </w:pPr>
-      <w:r>
-        <w:t>2. Contexto Organizacional</w:t>
-      </w:r>
-    </w:p>
-    <w:p>
-      <w:pPr>
         <w:spacing w:after="100"/>
-      </w:pPr>
-      <w:r>
-        <w:rPr>
-          <w:sz w:val="19"/>
-          <w:szCs w:val="19"/>
-        </w:rPr>
-        <w:t xml:space="preserve">El dataset proviene del </w:t>
-      </w:r>
-      <w:r>
-        <w:rPr>
-          <w:b/>
-          <w:bCs/>
-          <w:sz w:val="19"/>
-          <w:szCs w:val="19"/>
-        </w:rPr>
-        <w:t>Programa Mundial de Alimentos (WFP)</w:t>
-      </w:r>
-      <w:r>
-        <w:rPr>
-          <w:sz w:val="19"/>
-          <w:szCs w:val="19"/>
-        </w:rPr>
-        <w:t xml:space="preserve"> de las Naciones Unidas. En Colombia, el WFP trabaja en coordinacion con el </w:t>
-      </w:r>
-      <w:r>
-        <w:rPr>
-          <w:b/>
-          <w:bCs/>
-          <w:sz w:val="19"/>
-          <w:szCs w:val="19"/>
-        </w:rPr>
-        <w:t>DANE</w:t>
-      </w:r>
-      <w:r>
-        <w:rPr>
-          <w:sz w:val="19"/>
-          <w:szCs w:val="19"/>
-        </w:rPr>
-        <w:t xml:space="preserve"> y el </w:t>
-      </w:r>
-      <w:r>
-        <w:rPr>
-          <w:b/>
-          <w:bCs/>
-          <w:sz w:val="19"/>
-          <w:szCs w:val="19"/>
-        </w:rPr>
-        <w:t>Ministerio de Agricultura</w:t>
-      </w:r>
-      <w:r>
-        <w:rPr>
-          <w:sz w:val="19"/>
-          <w:szCs w:val="19"/>
-        </w:rPr>
-        <w:t xml:space="preserve"> para monitorear la seguridad alimentaria del pais.</w:t>
+        <w:jc w:val="both"/>
+        <w:rPr>
+          <w:sz w:val="22"/>
+          <w:szCs w:val="22"/>
+        </w:rPr>
+      </w:pPr>
+      <w:r>
+        <w:rPr>
+          <w:sz w:val="22"/>
+          <w:szCs w:val="22"/>
+        </w:rPr>
+        <w:t xml:space="preserve">El </w:t>
+      </w:r>
+      <w:proofErr w:type="spellStart"/>
+      <w:r>
+        <w:rPr>
+          <w:sz w:val="22"/>
+          <w:szCs w:val="22"/>
+        </w:rPr>
+        <w:t>dataset</w:t>
+      </w:r>
+      <w:proofErr w:type="spellEnd"/>
+      <w:r>
+        <w:rPr>
+          <w:sz w:val="22"/>
+          <w:szCs w:val="22"/>
+        </w:rPr>
+        <w:t xml:space="preserve"> proviene del Programa Mundial de Alimentos (WFP) de las Naciones Unidas. En Colombia, el WFP trabaja en </w:t>
+      </w:r>
+      <w:r>
+        <w:rPr>
+          <w:sz w:val="22"/>
+          <w:szCs w:val="22"/>
+        </w:rPr>
+        <w:t>coordinación</w:t>
+      </w:r>
+      <w:r>
+        <w:rPr>
+          <w:sz w:val="22"/>
+          <w:szCs w:val="22"/>
+        </w:rPr>
+        <w:t xml:space="preserve"> con el DANE y el Ministerio de Agricultura para monitorear la seguridad alimentaria del </w:t>
+      </w:r>
+      <w:r>
+        <w:rPr>
+          <w:sz w:val="22"/>
+          <w:szCs w:val="22"/>
+        </w:rPr>
+        <w:t>país</w:t>
+      </w:r>
+      <w:r>
+        <w:rPr>
+          <w:sz w:val="22"/>
+          <w:szCs w:val="22"/>
+        </w:rPr>
+        <w:t>.</w:t>
       </w:r>
     </w:p>
     <w:p>
@@ -255,22 +441,55 @@
           <w:numId w:val="2"/>
         </w:numPr>
         <w:spacing w:after="60"/>
+        <w:jc w:val="both"/>
+        <w:rPr>
+          <w:sz w:val="22"/>
+          <w:szCs w:val="22"/>
+        </w:rPr>
       </w:pPr>
       <w:r>
         <w:rPr>
           <w:b/>
           <w:bCs/>
-          <w:sz w:val="19"/>
-          <w:szCs w:val="19"/>
+          <w:sz w:val="22"/>
+          <w:szCs w:val="22"/>
         </w:rPr>
         <w:t xml:space="preserve">Directores de seguridad alimentaria (WFP Colombia): </w:t>
       </w:r>
       <w:r>
         <w:rPr>
-          <w:sz w:val="19"/>
-          <w:szCs w:val="19"/>
-        </w:rPr>
-        <w:t>Priorizan la asignacion de recursos de asistencia alimentaria identificando regiones y periodos con alzas criticas de precios.</w:t>
+          <w:sz w:val="22"/>
+          <w:szCs w:val="22"/>
+        </w:rPr>
+        <w:t xml:space="preserve">Priorizan la </w:t>
+      </w:r>
+      <w:r>
+        <w:rPr>
+          <w:sz w:val="22"/>
+          <w:szCs w:val="22"/>
+        </w:rPr>
+        <w:t>asignación</w:t>
+      </w:r>
+      <w:r>
+        <w:rPr>
+          <w:sz w:val="22"/>
+          <w:szCs w:val="22"/>
+        </w:rPr>
+        <w:t xml:space="preserve"> de recursos de asistencia alimentaria identificando regiones y periodos con alzas </w:t>
+      </w:r>
+      <w:r>
+        <w:rPr>
+          <w:sz w:val="22"/>
+          <w:szCs w:val="22"/>
+        </w:rPr>
+        <w:t>críticas</w:t>
+      </w:r>
+      <w:r>
+        <w:rPr>
+          <w:sz w:val="22"/>
+          <w:szCs w:val="22"/>
+        </w:rPr>
+        <w:t xml:space="preserve"> de precios.</w:t>
       </w:r>
     </w:p>
     <w:p>
@@ -281,22 +500,83 @@
           <w:numId w:val="2"/>
         </w:numPr>
         <w:spacing w:after="60"/>
+        <w:jc w:val="both"/>
+        <w:rPr>
+          <w:sz w:val="22"/>
+          <w:szCs w:val="22"/>
+        </w:rPr>
       </w:pPr>
       <w:r>
         <w:rPr>
           <w:b/>
           <w:bCs/>
-          <w:sz w:val="19"/>
-          <w:szCs w:val="19"/>
+          <w:sz w:val="22"/>
+          <w:szCs w:val="22"/>
         </w:rPr>
         <w:t xml:space="preserve">Analistas del Ministerio de Agricultura: </w:t>
       </w:r>
       <w:r>
         <w:rPr>
-          <w:sz w:val="19"/>
-          <w:szCs w:val="19"/>
-        </w:rPr>
-        <w:t>Monitorean la volatilidad de precios para disenar subsidios, controles de precios o politicas de importacion/exportacion.</w:t>
+          <w:sz w:val="22"/>
+          <w:szCs w:val="22"/>
+        </w:rPr>
+        <w:t xml:space="preserve">Monitorean la volatilidad de precios para </w:t>
+      </w:r>
+      <w:r>
+        <w:rPr>
+          <w:sz w:val="22"/>
+          <w:szCs w:val="22"/>
+        </w:rPr>
+        <w:t>diseñar</w:t>
+      </w:r>
+      <w:r>
+        <w:rPr>
+          <w:sz w:val="22"/>
+          <w:szCs w:val="22"/>
+        </w:rPr>
+        <w:t xml:space="preserve"> subsidios, controles de precios o </w:t>
+      </w:r>
+      <w:r>
+        <w:rPr>
+          <w:sz w:val="22"/>
+          <w:szCs w:val="22"/>
+        </w:rPr>
+        <w:t>políticas</w:t>
+      </w:r>
+      <w:r>
+        <w:rPr>
+          <w:sz w:val="22"/>
+          <w:szCs w:val="22"/>
+        </w:rPr>
+        <w:t xml:space="preserve"> de </w:t>
+      </w:r>
+      <w:r>
+        <w:rPr>
+          <w:sz w:val="22"/>
+          <w:szCs w:val="22"/>
+        </w:rPr>
+        <w:t>importación</w:t>
+      </w:r>
+      <w:r>
+        <w:rPr>
+          <w:sz w:val="22"/>
+          <w:szCs w:val="22"/>
+        </w:rPr>
+        <w:t>/</w:t>
+      </w:r>
+      <w:r>
+        <w:rPr>
+          <w:sz w:val="22"/>
+          <w:szCs w:val="22"/>
+        </w:rPr>
+        <w:t>exportación</w:t>
+      </w:r>
+      <w:r>
+        <w:rPr>
+          <w:sz w:val="22"/>
+          <w:szCs w:val="22"/>
+        </w:rPr>
+        <w:t>.</w:t>
       </w:r>
     </w:p>
     <w:p>
@@ -307,22 +587,41 @@
           <w:numId w:val="2"/>
         </w:numPr>
         <w:spacing w:after="120"/>
+        <w:jc w:val="both"/>
+        <w:rPr>
+          <w:sz w:val="22"/>
+          <w:szCs w:val="22"/>
+        </w:rPr>
       </w:pPr>
       <w:r>
         <w:rPr>
           <w:b/>
           <w:bCs/>
-          <w:sz w:val="19"/>
-          <w:szCs w:val="19"/>
+          <w:sz w:val="22"/>
+          <w:szCs w:val="22"/>
         </w:rPr>
         <w:t xml:space="preserve">Gobiernos departamentales: </w:t>
       </w:r>
       <w:r>
         <w:rPr>
-          <w:sz w:val="19"/>
-          <w:szCs w:val="19"/>
-        </w:rPr>
-        <w:t>Identifican disparidades regionales de precios para mejorar infraestructura de distribucion y cadenas de abastecimiento locales.</w:t>
+          <w:sz w:val="22"/>
+          <w:szCs w:val="22"/>
+        </w:rPr>
+        <w:t xml:space="preserve">Identifican disparidades regionales de precios para mejorar infraestructura de </w:t>
+      </w:r>
+      <w:r>
+        <w:rPr>
+          <w:sz w:val="22"/>
+          <w:szCs w:val="22"/>
+        </w:rPr>
+        <w:t>distribución</w:t>
+      </w:r>
+      <w:r>
+        <w:rPr>
+          <w:sz w:val="22"/>
+          <w:szCs w:val="22"/>
+        </w:rPr>
+        <w:t xml:space="preserve"> y cadenas de abastecimiento locales.</w:t>
       </w:r>
     </w:p>
     <w:p>
@@ -330,7 +629,19 @@
         <w:pStyle w:val="Ttulo1"/>
       </w:pPr>
       <w:r>
-        <w:t>3. Justificacion del Uso de Analitica Visual</w:t>
+        <w:t xml:space="preserve">3. </w:t>
+      </w:r>
+      <w:r>
+        <w:t>Justificación</w:t>
+      </w:r>
+      <w:r>
+        <w:t xml:space="preserve"> del Uso de </w:t>
+      </w:r>
+      <w:r>
+        <w:t>Analítica</w:t>
+      </w:r>
+      <w:r>
+        <w:t xml:space="preserve"> Visual</w:t>
       </w:r>
     </w:p>
     <w:p>
@@ -341,22 +652,115 @@
           <w:numId w:val="2"/>
         </w:numPr>
         <w:spacing w:after="60"/>
+        <w:jc w:val="both"/>
+        <w:rPr>
+          <w:sz w:val="22"/>
+          <w:szCs w:val="22"/>
+        </w:rPr>
       </w:pPr>
       <w:r>
         <w:rPr>
           <w:b/>
           <w:bCs/>
-          <w:sz w:val="19"/>
-          <w:szCs w:val="19"/>
-        </w:rPr>
-        <w:t xml:space="preserve">Dimensionalidad temporal y geografica: </w:t>
-      </w:r>
-      <w:r>
-        <w:rPr>
-          <w:sz w:val="19"/>
-          <w:szCs w:val="19"/>
-        </w:rPr>
-        <w:t>Con 25 anos de datos (2000-2025), 27 mercados en 22 departamentos y 86 productos, las tablas numericas resultan insuficientes. Las visualizaciones interactivas permiten explorar multiples dimensiones simultaneamente.</w:t>
+          <w:sz w:val="22"/>
+          <w:szCs w:val="22"/>
+        </w:rPr>
+        <w:t xml:space="preserve">Dimensionalidad temporal y </w:t>
+      </w:r>
+      <w:r>
+        <w:rPr>
+          <w:b/>
+          <w:bCs/>
+          <w:sz w:val="22"/>
+          <w:szCs w:val="22"/>
+        </w:rPr>
+        <w:t>geográfica</w:t>
+      </w:r>
+      <w:r>
+        <w:rPr>
+          <w:b/>
+          <w:bCs/>
+          <w:sz w:val="22"/>
+          <w:szCs w:val="22"/>
+        </w:rPr>
+        <w:t xml:space="preserve">: </w:t>
+      </w:r>
+      <w:r>
+        <w:rPr>
+          <w:sz w:val="22"/>
+          <w:szCs w:val="22"/>
+        </w:rPr>
+        <w:t xml:space="preserve">Con 25 </w:t>
+      </w:r>
+      <w:r>
+        <w:rPr>
+          <w:sz w:val="22"/>
+          <w:szCs w:val="22"/>
+        </w:rPr>
+        <w:t>años</w:t>
+      </w:r>
+      <w:r>
+        <w:rPr>
+          <w:sz w:val="22"/>
+          <w:szCs w:val="22"/>
+        </w:rPr>
+        <w:t xml:space="preserve"> de datos (2000-202</w:t>
+      </w:r>
+      <w:r>
+        <w:rPr>
+          <w:sz w:val="22"/>
+          <w:szCs w:val="22"/>
+        </w:rPr>
+        <w:t>4</w:t>
+      </w:r>
+      <w:r>
+        <w:rPr>
+          <w:sz w:val="22"/>
+          <w:szCs w:val="22"/>
+        </w:rPr>
+        <w:t xml:space="preserve">), 27 mercados en 22 departamentos y 86 productos, las tablas </w:t>
+      </w:r>
+      <w:r>
+        <w:rPr>
+          <w:sz w:val="22"/>
+          <w:szCs w:val="22"/>
+        </w:rPr>
+        <w:t>numéricas</w:t>
+      </w:r>
+      <w:r>
+        <w:rPr>
+          <w:sz w:val="22"/>
+          <w:szCs w:val="22"/>
+        </w:rPr>
+        <w:t xml:space="preserve"> resultan insuficientes. Las visualizaciones interactivas permiten explorar </w:t>
+      </w:r>
+      <w:r>
+        <w:rPr>
+          <w:sz w:val="22"/>
+          <w:szCs w:val="22"/>
+        </w:rPr>
+        <w:t>múltiples</w:t>
+      </w:r>
+      <w:r>
+        <w:rPr>
+          <w:sz w:val="22"/>
+          <w:szCs w:val="22"/>
+        </w:rPr>
+        <w:t xml:space="preserve"> dimensiones </w:t>
+      </w:r>
+      <w:r>
+        <w:rPr>
+          <w:sz w:val="22"/>
+          <w:szCs w:val="22"/>
+        </w:rPr>
+        <w:t>simultáneamente</w:t>
+      </w:r>
+      <w:r>
+        <w:rPr>
+          <w:sz w:val="22"/>
+          <w:szCs w:val="22"/>
+        </w:rPr>
+        <w:t>.</w:t>
       </w:r>
     </w:p>
     <w:p>
@@ -367,22 +771,71 @@
           <w:numId w:val="2"/>
         </w:numPr>
         <w:spacing w:after="60"/>
+        <w:jc w:val="both"/>
+        <w:rPr>
+          <w:sz w:val="22"/>
+          <w:szCs w:val="22"/>
+        </w:rPr>
       </w:pPr>
       <w:r>
         <w:rPr>
           <w:b/>
           <w:bCs/>
-          <w:sz w:val="19"/>
-          <w:szCs w:val="19"/>
+          <w:sz w:val="22"/>
+          <w:szCs w:val="22"/>
         </w:rPr>
         <w:t xml:space="preserve">Patrones estacionales: </w:t>
       </w:r>
       <w:r>
         <w:rPr>
-          <w:sz w:val="19"/>
-          <w:szCs w:val="19"/>
-        </w:rPr>
-        <w:t>Los precios presentan ciclos estacionales que solo son evidentes al visualizar series temporales. Un dashboard permite superponer anos y detectar patrones recurrentes vs. eventos atipicos.</w:t>
+          <w:sz w:val="22"/>
+          <w:szCs w:val="22"/>
+        </w:rPr>
+        <w:t xml:space="preserve">Los precios presentan ciclos estacionales que solo son evidentes al visualizar series temporales. Un </w:t>
+      </w:r>
+      <w:proofErr w:type="spellStart"/>
+      <w:r>
+        <w:rPr>
+          <w:sz w:val="22"/>
+          <w:szCs w:val="22"/>
+        </w:rPr>
+        <w:t>dashboard</w:t>
+      </w:r>
+      <w:proofErr w:type="spellEnd"/>
+      <w:r>
+        <w:rPr>
+          <w:sz w:val="22"/>
+          <w:szCs w:val="22"/>
+        </w:rPr>
+        <w:t xml:space="preserve"> permite superponer </w:t>
+      </w:r>
+      <w:r>
+        <w:rPr>
+          <w:sz w:val="22"/>
+          <w:szCs w:val="22"/>
+        </w:rPr>
+        <w:t>años</w:t>
+      </w:r>
+      <w:r>
+        <w:rPr>
+          <w:sz w:val="22"/>
+          <w:szCs w:val="22"/>
+        </w:rPr>
+        <w:t xml:space="preserve"> y detectar patrones recurrentes vs. eventos </w:t>
+      </w:r>
+      <w:r>
+        <w:rPr>
+          <w:sz w:val="22"/>
+          <w:szCs w:val="22"/>
+        </w:rPr>
+        <w:t>atípicos</w:t>
+      </w:r>
+      <w:r>
+        <w:rPr>
+          <w:sz w:val="22"/>
+          <w:szCs w:val="22"/>
+        </w:rPr>
+        <w:t>.</w:t>
       </w:r>
     </w:p>
     <w:p>
@@ -393,22 +846,108 @@
           <w:numId w:val="2"/>
         </w:numPr>
         <w:spacing w:after="60"/>
+        <w:jc w:val="both"/>
+        <w:rPr>
+          <w:sz w:val="22"/>
+          <w:szCs w:val="22"/>
+        </w:rPr>
       </w:pPr>
       <w:r>
         <w:rPr>
           <w:b/>
           <w:bCs/>
-          <w:sz w:val="19"/>
-          <w:szCs w:val="19"/>
-        </w:rPr>
-        <w:t xml:space="preserve">Comparacion entre mercados: </w:t>
-      </w:r>
-      <w:r>
-        <w:rPr>
-          <w:sz w:val="19"/>
-          <w:szCs w:val="19"/>
-        </w:rPr>
-        <w:t>La variacion geografica de precios requiere representaciones que comparen simultaneamente los 27 mercados, facilitado por encodings de color, facetas y tooltips en Altair/Vega-Lite.</w:t>
+          <w:sz w:val="22"/>
+          <w:szCs w:val="22"/>
+        </w:rPr>
+        <w:t>Comparación</w:t>
+      </w:r>
+      <w:r>
+        <w:rPr>
+          <w:b/>
+          <w:bCs/>
+          <w:sz w:val="22"/>
+          <w:szCs w:val="22"/>
+        </w:rPr>
+        <w:t xml:space="preserve"> entre mercados: </w:t>
+      </w:r>
+      <w:r>
+        <w:rPr>
+          <w:sz w:val="22"/>
+          <w:szCs w:val="22"/>
+        </w:rPr>
+        <w:t xml:space="preserve">La </w:t>
+      </w:r>
+      <w:r>
+        <w:rPr>
+          <w:sz w:val="22"/>
+          <w:szCs w:val="22"/>
+        </w:rPr>
+        <w:t>variación</w:t>
+      </w:r>
+      <w:r>
+        <w:rPr>
+          <w:sz w:val="22"/>
+          <w:szCs w:val="22"/>
+        </w:rPr>
+        <w:t xml:space="preserve"> </w:t>
+      </w:r>
+      <w:r>
+        <w:rPr>
+          <w:sz w:val="22"/>
+          <w:szCs w:val="22"/>
+        </w:rPr>
+        <w:t>geográfica</w:t>
+      </w:r>
+      <w:r>
+        <w:rPr>
+          <w:sz w:val="22"/>
+          <w:szCs w:val="22"/>
+        </w:rPr>
+        <w:t xml:space="preserve"> de precios requiere representaciones que comparen </w:t>
+      </w:r>
+      <w:r>
+        <w:rPr>
+          <w:sz w:val="22"/>
+          <w:szCs w:val="22"/>
+        </w:rPr>
+        <w:t>simultáneamente</w:t>
+      </w:r>
+      <w:r>
+        <w:rPr>
+          <w:sz w:val="22"/>
+          <w:szCs w:val="22"/>
+        </w:rPr>
+        <w:t xml:space="preserve"> los 27 mercados, facilitado por </w:t>
+      </w:r>
+      <w:r>
+        <w:rPr>
+          <w:sz w:val="22"/>
+          <w:szCs w:val="22"/>
+        </w:rPr>
+        <w:t>codificaciones</w:t>
+      </w:r>
+      <w:r>
+        <w:rPr>
+          <w:sz w:val="22"/>
+          <w:szCs w:val="22"/>
+        </w:rPr>
+        <w:t xml:space="preserve"> de color, facetas y </w:t>
+      </w:r>
+      <w:proofErr w:type="spellStart"/>
+      <w:r>
+        <w:rPr>
+          <w:sz w:val="22"/>
+          <w:szCs w:val="22"/>
+        </w:rPr>
+        <w:t>tooltips</w:t>
+      </w:r>
+      <w:proofErr w:type="spellEnd"/>
+      <w:r>
+        <w:rPr>
+          <w:sz w:val="22"/>
+          <w:szCs w:val="22"/>
+        </w:rPr>
+        <w:t>.</w:t>
       </w:r>
     </w:p>
     <w:p>
@@ -419,22 +958,86 @@
           <w:numId w:val="2"/>
         </w:numPr>
         <w:spacing w:after="100"/>
-      </w:pPr>
+        <w:jc w:val="both"/>
+        <w:rPr>
+          <w:sz w:val="22"/>
+          <w:szCs w:val="22"/>
+        </w:rPr>
+      </w:pPr>
+      <w:proofErr w:type="spellStart"/>
       <w:r>
         <w:rPr>
           <w:b/>
           <w:bCs/>
-          <w:sz w:val="19"/>
-          <w:szCs w:val="19"/>
-        </w:rPr>
-        <w:t xml:space="preserve">Comunicacion a stakeholders: </w:t>
-      </w:r>
-      <w:r>
-        <w:rPr>
-          <w:sz w:val="19"/>
-          <w:szCs w:val="19"/>
-        </w:rPr>
-        <w:t>Los funcionarios publicos necesitan visualizaciones claras y narrativas visuales — no modelos estadisticos complejos — para tomar decisiones oportunas. Siguiendo los principios de Tufte sobre maximizacion del ratio datos-tinta.</w:t>
+          <w:sz w:val="22"/>
+          <w:szCs w:val="22"/>
+        </w:rPr>
+        <w:t>Comunicacion</w:t>
+      </w:r>
+      <w:proofErr w:type="spellEnd"/>
+      <w:r>
+        <w:rPr>
+          <w:b/>
+          <w:bCs/>
+          <w:sz w:val="22"/>
+          <w:szCs w:val="22"/>
+        </w:rPr>
+        <w:t xml:space="preserve"> a </w:t>
+      </w:r>
+      <w:proofErr w:type="spellStart"/>
+      <w:r>
+        <w:rPr>
+          <w:b/>
+          <w:bCs/>
+          <w:sz w:val="22"/>
+          <w:szCs w:val="22"/>
+        </w:rPr>
+        <w:t>stakeholders</w:t>
+      </w:r>
+      <w:proofErr w:type="spellEnd"/>
+      <w:r>
+        <w:rPr>
+          <w:b/>
+          <w:bCs/>
+          <w:sz w:val="22"/>
+          <w:szCs w:val="22"/>
+        </w:rPr>
+        <w:t xml:space="preserve">: </w:t>
+      </w:r>
+      <w:r>
+        <w:rPr>
+          <w:sz w:val="22"/>
+          <w:szCs w:val="22"/>
+        </w:rPr>
+        <w:t xml:space="preserve">Los funcionarios </w:t>
+      </w:r>
+      <w:r>
+        <w:rPr>
+          <w:sz w:val="22"/>
+          <w:szCs w:val="22"/>
+        </w:rPr>
+        <w:t>públicos</w:t>
+      </w:r>
+      <w:r>
+        <w:rPr>
+          <w:sz w:val="22"/>
+          <w:szCs w:val="22"/>
+        </w:rPr>
+        <w:t xml:space="preserve"> necesitan visualizaciones claras y narrativas visuales — no modelos </w:t>
+      </w:r>
+      <w:r>
+        <w:rPr>
+          <w:sz w:val="22"/>
+          <w:szCs w:val="22"/>
+        </w:rPr>
+        <w:t>estadísticos</w:t>
+      </w:r>
+      <w:r>
+        <w:rPr>
+          <w:sz w:val="22"/>
+          <w:szCs w:val="22"/>
+        </w:rPr>
+        <w:t xml:space="preserve"> complejos — para tomar decisiones oportunas.</w:t>
       </w:r>
     </w:p>
     <w:p>
@@ -447,7 +1050,14 @@
         <w:pStyle w:val="Ttulo1"/>
       </w:pPr>
       <w:r>
-        <w:t>4. Descripcion de los Datos</w:t>
+        <w:lastRenderedPageBreak/>
+        <w:t xml:space="preserve">4. </w:t>
+      </w:r>
+      <w:r>
+        <w:t>Descripción</w:t>
+      </w:r>
+      <w:r>
+        <w:t xml:space="preserve"> de los Datos</w:t>
       </w:r>
     </w:p>
     <w:p>
@@ -455,19 +1065,165 @@
         <w:pStyle w:val="Ttulo2"/>
       </w:pPr>
       <w:r>
-        <w:t>Fuente y contexto de recoleccion</w:t>
-      </w:r>
+        <w:t xml:space="preserve">Fuente y contexto de </w:t>
+      </w:r>
+      <w:proofErr w:type="spellStart"/>
+      <w:r>
+        <w:t>recoleccion</w:t>
+      </w:r>
+      <w:proofErr w:type="spellEnd"/>
     </w:p>
     <w:p>
       <w:pPr>
         <w:spacing w:after="100"/>
-      </w:pPr>
-      <w:r>
-        <w:rPr>
-          <w:sz w:val="19"/>
-          <w:szCs w:val="19"/>
-        </w:rPr>
-        <w:t>El dataset "WFP Food Prices for Colombia" es recopilado y publicado por el Programa Mundial de Alimentos a traves de la plataforma Humanitarian Data Exchange (HDX). Los datos provienen del sistema de monitoreo de precios de alimentos del WFP, que recolecta precios de forma sistematica en mercados mayoristas y minoristas de las principales ciudades de Colombia. La recoleccion se realiza con frecuencia mensual, registrando el precio de cada producto en pesos colombianos (COP) y su equivalente en dolares estadounidenses (USD).</w:t>
+        <w:jc w:val="both"/>
+        <w:rPr>
+          <w:sz w:val="22"/>
+          <w:szCs w:val="22"/>
+        </w:rPr>
+      </w:pPr>
+      <w:r>
+        <w:rPr>
+          <w:sz w:val="22"/>
+          <w:szCs w:val="22"/>
+        </w:rPr>
+        <w:t xml:space="preserve">El </w:t>
+      </w:r>
+      <w:proofErr w:type="spellStart"/>
+      <w:r>
+        <w:rPr>
+          <w:sz w:val="22"/>
+          <w:szCs w:val="22"/>
+        </w:rPr>
+        <w:t>dataset</w:t>
+      </w:r>
+      <w:proofErr w:type="spellEnd"/>
+      <w:r>
+        <w:rPr>
+          <w:sz w:val="22"/>
+          <w:szCs w:val="22"/>
+        </w:rPr>
+        <w:t xml:space="preserve"> "WFP </w:t>
+      </w:r>
+      <w:proofErr w:type="spellStart"/>
+      <w:r>
+        <w:rPr>
+          <w:sz w:val="22"/>
+          <w:szCs w:val="22"/>
+        </w:rPr>
+        <w:t>Food</w:t>
+      </w:r>
+      <w:proofErr w:type="spellEnd"/>
+      <w:r>
+        <w:rPr>
+          <w:sz w:val="22"/>
+          <w:szCs w:val="22"/>
+        </w:rPr>
+        <w:t xml:space="preserve"> </w:t>
+      </w:r>
+      <w:proofErr w:type="spellStart"/>
+      <w:r>
+        <w:rPr>
+          <w:sz w:val="22"/>
+          <w:szCs w:val="22"/>
+        </w:rPr>
+        <w:t>Prices</w:t>
+      </w:r>
+      <w:proofErr w:type="spellEnd"/>
+      <w:r>
+        <w:rPr>
+          <w:sz w:val="22"/>
+          <w:szCs w:val="22"/>
+        </w:rPr>
+        <w:t xml:space="preserve"> </w:t>
+      </w:r>
+      <w:proofErr w:type="spellStart"/>
+      <w:r>
+        <w:rPr>
+          <w:sz w:val="22"/>
+          <w:szCs w:val="22"/>
+        </w:rPr>
+        <w:t>for</w:t>
+      </w:r>
+      <w:proofErr w:type="spellEnd"/>
+      <w:r>
+        <w:rPr>
+          <w:sz w:val="22"/>
+          <w:szCs w:val="22"/>
+        </w:rPr>
+        <w:t xml:space="preserve"> Colombia" es recopilado y publicado por el Programa Mundial de Alimentos a </w:t>
+      </w:r>
+      <w:r>
+        <w:rPr>
+          <w:sz w:val="22"/>
+          <w:szCs w:val="22"/>
+        </w:rPr>
+        <w:t>través</w:t>
+      </w:r>
+      <w:r>
+        <w:rPr>
+          <w:sz w:val="22"/>
+          <w:szCs w:val="22"/>
+        </w:rPr>
+        <w:t xml:space="preserve"> de la plataforma </w:t>
+      </w:r>
+      <w:proofErr w:type="spellStart"/>
+      <w:r>
+        <w:rPr>
+          <w:sz w:val="22"/>
+          <w:szCs w:val="22"/>
+        </w:rPr>
+        <w:t>Humanitarian</w:t>
+      </w:r>
+      <w:proofErr w:type="spellEnd"/>
+      <w:r>
+        <w:rPr>
+          <w:sz w:val="22"/>
+          <w:szCs w:val="22"/>
+        </w:rPr>
+        <w:t xml:space="preserve"> Data Exchange (HDX). Los datos provienen del sistema de monitoreo de precios de alimentos del WFP, que recolecta precios de forma </w:t>
+      </w:r>
+      <w:r>
+        <w:rPr>
+          <w:sz w:val="22"/>
+          <w:szCs w:val="22"/>
+        </w:rPr>
+        <w:t>sistemática</w:t>
+      </w:r>
+      <w:r>
+        <w:rPr>
+          <w:sz w:val="22"/>
+          <w:szCs w:val="22"/>
+        </w:rPr>
+        <w:t xml:space="preserve"> en mercados mayoristas y minoristas de las principales ciudades de Colombia. La </w:t>
+      </w:r>
+      <w:r>
+        <w:rPr>
+          <w:sz w:val="22"/>
+          <w:szCs w:val="22"/>
+        </w:rPr>
+        <w:t>recolección</w:t>
+      </w:r>
+      <w:r>
+        <w:rPr>
+          <w:sz w:val="22"/>
+          <w:szCs w:val="22"/>
+        </w:rPr>
+        <w:t xml:space="preserve"> se realiza con frecuencia mensual, registrando el precio de cada producto en pesos colombianos (COP) y su equivalente en </w:t>
+      </w:r>
+      <w:r>
+        <w:rPr>
+          <w:sz w:val="22"/>
+          <w:szCs w:val="22"/>
+        </w:rPr>
+        <w:t>dólares</w:t>
+      </w:r>
+      <w:r>
+        <w:rPr>
+          <w:sz w:val="22"/>
+          <w:szCs w:val="22"/>
+        </w:rPr>
+        <w:t xml:space="preserve"> estadounidenses (USD).</w:t>
       </w:r>
     </w:p>
     <w:p>
@@ -475,12 +1231,16 @@
         <w:pStyle w:val="Ttulo2"/>
       </w:pPr>
       <w:r>
-        <w:t>Ficha tecnica</w:t>
+        <w:t xml:space="preserve">Ficha </w:t>
+      </w:r>
+      <w:r>
+        <w:t>técnica</w:t>
       </w:r>
     </w:p>
     <w:tbl>
       <w:tblPr>
-        <w:tblW w:w="9360" w:type="dxa"/>
+        <w:tblW w:w="0" w:type="auto"/>
+        <w:jc w:val="center"/>
         <w:tblBorders>
           <w:top w:val="single" w:sz="4" w:space="0" w:color="auto"/>
           <w:left w:val="single" w:sz="4" w:space="0" w:color="auto"/>
@@ -496,13 +1256,16 @@
         <w:tblLook w:val="04A0" w:firstRow="1" w:lastRow="0" w:firstColumn="1" w:lastColumn="0" w:noHBand="0" w:noVBand="1"/>
       </w:tblPr>
       <w:tblGrid>
-        <w:gridCol w:w="2800"/>
-        <w:gridCol w:w="6560"/>
+        <w:gridCol w:w="1315"/>
+        <w:gridCol w:w="4339"/>
       </w:tblGrid>
       <w:tr>
+        <w:trPr>
+          <w:jc w:val="center"/>
+        </w:trPr>
         <w:tc>
           <w:tcPr>
-            <w:tcW w:w="2800" w:type="dxa"/>
+            <w:tcW w:w="0" w:type="auto"/>
             <w:tcBorders>
               <w:top w:val="single" w:sz="1" w:space="0" w:color="CCCCCC"/>
               <w:left w:val="single" w:sz="1" w:space="0" w:color="CCCCCC"/>
@@ -527,13 +1290,13 @@
                 <w:sz w:val="18"/>
                 <w:szCs w:val="18"/>
               </w:rPr>
-              <w:t>Parametro</w:t>
+              <w:t>Parámetro</w:t>
             </w:r>
           </w:p>
         </w:tc>
         <w:tc>
           <w:tcPr>
-            <w:tcW w:w="6560" w:type="dxa"/>
+            <w:tcW w:w="0" w:type="auto"/>
             <w:tcBorders>
               <w:top w:val="single" w:sz="1" w:space="0" w:color="CCCCCC"/>
               <w:left w:val="single" w:sz="1" w:space="0" w:color="CCCCCC"/>
@@ -564,9 +1327,12 @@
         </w:tc>
       </w:tr>
       <w:tr>
+        <w:trPr>
+          <w:jc w:val="center"/>
+        </w:trPr>
         <w:tc>
           <w:tcPr>
-            <w:tcW w:w="2800" w:type="dxa"/>
+            <w:tcW w:w="0" w:type="auto"/>
             <w:tcBorders>
               <w:top w:val="single" w:sz="1" w:space="0" w:color="CCCCCC"/>
               <w:left w:val="single" w:sz="1" w:space="0" w:color="CCCCCC"/>
@@ -579,6 +1345,7 @@
               <w:bottom w:w="60" w:type="dxa"/>
               <w:right w:w="100" w:type="dxa"/>
             </w:tcMar>
+            <w:vAlign w:val="center"/>
           </w:tcPr>
           <w:p>
             <w:r>
@@ -594,7 +1361,7 @@
         </w:tc>
         <w:tc>
           <w:tcPr>
-            <w:tcW w:w="6560" w:type="dxa"/>
+            <w:tcW w:w="0" w:type="auto"/>
             <w:tcBorders>
               <w:top w:val="single" w:sz="1" w:space="0" w:color="CCCCCC"/>
               <w:left w:val="single" w:sz="1" w:space="0" w:color="CCCCCC"/>
@@ -607,6 +1374,7 @@
               <w:bottom w:w="60" w:type="dxa"/>
               <w:right w:w="100" w:type="dxa"/>
             </w:tcMar>
+            <w:vAlign w:val="center"/>
           </w:tcPr>
           <w:p>
             <w:r>
@@ -614,15 +1382,34 @@
                 <w:sz w:val="17"/>
                 <w:szCs w:val="17"/>
               </w:rPr>
-              <w:t>WFP - Humanitarian Data Exchange (HDX)</w:t>
+              <w:t xml:space="preserve">WFP - </w:t>
+            </w:r>
+            <w:proofErr w:type="spellStart"/>
+            <w:r>
+              <w:rPr>
+                <w:sz w:val="17"/>
+                <w:szCs w:val="17"/>
+              </w:rPr>
+              <w:t>Humanitarian</w:t>
+            </w:r>
+            <w:proofErr w:type="spellEnd"/>
+            <w:r>
+              <w:rPr>
+                <w:sz w:val="17"/>
+                <w:szCs w:val="17"/>
+              </w:rPr>
+              <w:t xml:space="preserve"> Data Exchange (HDX)</w:t>
             </w:r>
           </w:p>
         </w:tc>
       </w:tr>
       <w:tr>
+        <w:trPr>
+          <w:jc w:val="center"/>
+        </w:trPr>
         <w:tc>
           <w:tcPr>
-            <w:tcW w:w="2800" w:type="dxa"/>
+            <w:tcW w:w="0" w:type="auto"/>
             <w:tcBorders>
               <w:top w:val="single" w:sz="1" w:space="0" w:color="CCCCCC"/>
               <w:left w:val="single" w:sz="1" w:space="0" w:color="CCCCCC"/>
@@ -636,6 +1423,7 @@
               <w:bottom w:w="60" w:type="dxa"/>
               <w:right w:w="100" w:type="dxa"/>
             </w:tcMar>
+            <w:vAlign w:val="center"/>
           </w:tcPr>
           <w:p>
             <w:r>
@@ -651,7 +1439,7 @@
         </w:tc>
         <w:tc>
           <w:tcPr>
-            <w:tcW w:w="6560" w:type="dxa"/>
+            <w:tcW w:w="0" w:type="auto"/>
             <w:tcBorders>
               <w:top w:val="single" w:sz="1" w:space="0" w:color="CCCCCC"/>
               <w:left w:val="single" w:sz="1" w:space="0" w:color="CCCCCC"/>
@@ -665,6 +1453,7 @@
               <w:bottom w:w="60" w:type="dxa"/>
               <w:right w:w="100" w:type="dxa"/>
             </w:tcMar>
+            <w:vAlign w:val="center"/>
           </w:tcPr>
           <w:p>
             <w:r>
@@ -672,15 +1461,43 @@
                 <w:sz w:val="17"/>
                 <w:szCs w:val="17"/>
               </w:rPr>
-              <w:t>data.humdata.org/dataset/wfp-food-prices-for-colombia</w:t>
-            </w:r>
+              <w:t>data.humdata.org/</w:t>
+            </w:r>
+            <w:proofErr w:type="spellStart"/>
+            <w:r>
+              <w:rPr>
+                <w:sz w:val="17"/>
+                <w:szCs w:val="17"/>
+              </w:rPr>
+              <w:t>dataset</w:t>
+            </w:r>
+            <w:proofErr w:type="spellEnd"/>
+            <w:r>
+              <w:rPr>
+                <w:sz w:val="17"/>
+                <w:szCs w:val="17"/>
+              </w:rPr>
+              <w:t>/</w:t>
+            </w:r>
+            <w:proofErr w:type="spellStart"/>
+            <w:r>
+              <w:rPr>
+                <w:sz w:val="17"/>
+                <w:szCs w:val="17"/>
+              </w:rPr>
+              <w:t>wfp-food-prices-for-colombia</w:t>
+            </w:r>
+            <w:proofErr w:type="spellEnd"/>
           </w:p>
         </w:tc>
       </w:tr>
       <w:tr>
+        <w:trPr>
+          <w:jc w:val="center"/>
+        </w:trPr>
         <w:tc>
           <w:tcPr>
-            <w:tcW w:w="2800" w:type="dxa"/>
+            <w:tcW w:w="0" w:type="auto"/>
             <w:tcBorders>
               <w:top w:val="single" w:sz="1" w:space="0" w:color="CCCCCC"/>
               <w:left w:val="single" w:sz="1" w:space="0" w:color="CCCCCC"/>
@@ -693,6 +1510,7 @@
               <w:bottom w:w="60" w:type="dxa"/>
               <w:right w:w="100" w:type="dxa"/>
             </w:tcMar>
+            <w:vAlign w:val="center"/>
           </w:tcPr>
           <w:p>
             <w:r>
@@ -708,7 +1526,7 @@
         </w:tc>
         <w:tc>
           <w:tcPr>
-            <w:tcW w:w="6560" w:type="dxa"/>
+            <w:tcW w:w="0" w:type="auto"/>
             <w:tcBorders>
               <w:top w:val="single" w:sz="1" w:space="0" w:color="CCCCCC"/>
               <w:left w:val="single" w:sz="1" w:space="0" w:color="CCCCCC"/>
@@ -721,6 +1539,7 @@
               <w:bottom w:w="60" w:type="dxa"/>
               <w:right w:w="100" w:type="dxa"/>
             </w:tcMar>
+            <w:vAlign w:val="center"/>
           </w:tcPr>
           <w:p>
             <w:r>
@@ -728,15 +1547,50 @@
                 <w:sz w:val="17"/>
                 <w:szCs w:val="17"/>
               </w:rPr>
-              <w:t>Enero 2000 - Noviembre 2025 (25 anos)</w:t>
+              <w:t xml:space="preserve">Enero 2000 - </w:t>
+            </w:r>
+            <w:proofErr w:type="gramStart"/>
+            <w:r>
+              <w:rPr>
+                <w:sz w:val="17"/>
+                <w:szCs w:val="17"/>
+              </w:rPr>
+              <w:t>Noviembre</w:t>
+            </w:r>
+            <w:proofErr w:type="gramEnd"/>
+            <w:r>
+              <w:rPr>
+                <w:sz w:val="17"/>
+                <w:szCs w:val="17"/>
+              </w:rPr>
+              <w:t xml:space="preserve"> 2025 (25 </w:t>
+            </w:r>
+            <w:proofErr w:type="spellStart"/>
+            <w:r>
+              <w:rPr>
+                <w:sz w:val="17"/>
+                <w:szCs w:val="17"/>
+              </w:rPr>
+              <w:t>anos</w:t>
+            </w:r>
+            <w:proofErr w:type="spellEnd"/>
+            <w:r>
+              <w:rPr>
+                <w:sz w:val="17"/>
+                <w:szCs w:val="17"/>
+              </w:rPr>
+              <w:t>)</w:t>
             </w:r>
           </w:p>
         </w:tc>
       </w:tr>
       <w:tr>
+        <w:trPr>
+          <w:jc w:val="center"/>
+        </w:trPr>
         <w:tc>
           <w:tcPr>
-            <w:tcW w:w="2800" w:type="dxa"/>
+            <w:tcW w:w="0" w:type="auto"/>
             <w:tcBorders>
               <w:top w:val="single" w:sz="1" w:space="0" w:color="CCCCCC"/>
               <w:left w:val="single" w:sz="1" w:space="0" w:color="CCCCCC"/>
@@ -750,6 +1604,7 @@
               <w:bottom w:w="60" w:type="dxa"/>
               <w:right w:w="100" w:type="dxa"/>
             </w:tcMar>
+            <w:vAlign w:val="center"/>
           </w:tcPr>
           <w:p>
             <w:r>
@@ -765,7 +1620,7 @@
         </w:tc>
         <w:tc>
           <w:tcPr>
-            <w:tcW w:w="6560" w:type="dxa"/>
+            <w:tcW w:w="0" w:type="auto"/>
             <w:tcBorders>
               <w:top w:val="single" w:sz="1" w:space="0" w:color="CCCCCC"/>
               <w:left w:val="single" w:sz="1" w:space="0" w:color="CCCCCC"/>
@@ -779,6 +1634,7 @@
               <w:bottom w:w="60" w:type="dxa"/>
               <w:right w:w="100" w:type="dxa"/>
             </w:tcMar>
+            <w:vAlign w:val="center"/>
           </w:tcPr>
           <w:p>
             <w:r>
@@ -792,9 +1648,12 @@
         </w:tc>
       </w:tr>
       <w:tr>
+        <w:trPr>
+          <w:jc w:val="center"/>
+        </w:trPr>
         <w:tc>
           <w:tcPr>
-            <w:tcW w:w="2800" w:type="dxa"/>
+            <w:tcW w:w="0" w:type="auto"/>
             <w:tcBorders>
               <w:top w:val="single" w:sz="1" w:space="0" w:color="CCCCCC"/>
               <w:left w:val="single" w:sz="1" w:space="0" w:color="CCCCCC"/>
@@ -807,6 +1666,7 @@
               <w:bottom w:w="60" w:type="dxa"/>
               <w:right w:w="100" w:type="dxa"/>
             </w:tcMar>
+            <w:vAlign w:val="center"/>
           </w:tcPr>
           <w:p>
             <w:r>
@@ -822,7 +1682,7 @@
         </w:tc>
         <w:tc>
           <w:tcPr>
-            <w:tcW w:w="6560" w:type="dxa"/>
+            <w:tcW w:w="0" w:type="auto"/>
             <w:tcBorders>
               <w:top w:val="single" w:sz="1" w:space="0" w:color="CCCCCC"/>
               <w:left w:val="single" w:sz="1" w:space="0" w:color="CCCCCC"/>
@@ -835,6 +1695,7 @@
               <w:bottom w:w="60" w:type="dxa"/>
               <w:right w:w="100" w:type="dxa"/>
             </w:tcMar>
+            <w:vAlign w:val="center"/>
           </w:tcPr>
           <w:p>
             <w:r>
@@ -848,9 +1709,12 @@
         </w:tc>
       </w:tr>
       <w:tr>
+        <w:trPr>
+          <w:jc w:val="center"/>
+        </w:trPr>
         <w:tc>
           <w:tcPr>
-            <w:tcW w:w="2800" w:type="dxa"/>
+            <w:tcW w:w="0" w:type="auto"/>
             <w:tcBorders>
               <w:top w:val="single" w:sz="1" w:space="0" w:color="CCCCCC"/>
               <w:left w:val="single" w:sz="1" w:space="0" w:color="CCCCCC"/>
@@ -864,6 +1728,7 @@
               <w:bottom w:w="60" w:type="dxa"/>
               <w:right w:w="100" w:type="dxa"/>
             </w:tcMar>
+            <w:vAlign w:val="center"/>
           </w:tcPr>
           <w:p>
             <w:r>
@@ -879,7 +1744,7 @@
         </w:tc>
         <w:tc>
           <w:tcPr>
-            <w:tcW w:w="6560" w:type="dxa"/>
+            <w:tcW w:w="0" w:type="auto"/>
             <w:tcBorders>
               <w:top w:val="single" w:sz="1" w:space="0" w:color="CCCCCC"/>
               <w:left w:val="single" w:sz="1" w:space="0" w:color="CCCCCC"/>
@@ -893,6 +1758,7 @@
               <w:bottom w:w="60" w:type="dxa"/>
               <w:right w:w="100" w:type="dxa"/>
             </w:tcMar>
+            <w:vAlign w:val="center"/>
           </w:tcPr>
           <w:p>
             <w:r>
@@ -906,9 +1772,12 @@
         </w:tc>
       </w:tr>
       <w:tr>
+        <w:trPr>
+          <w:jc w:val="center"/>
+        </w:trPr>
         <w:tc>
           <w:tcPr>
-            <w:tcW w:w="2800" w:type="dxa"/>
+            <w:tcW w:w="0" w:type="auto"/>
             <w:tcBorders>
               <w:top w:val="single" w:sz="1" w:space="0" w:color="CCCCCC"/>
               <w:left w:val="single" w:sz="1" w:space="0" w:color="CCCCCC"/>
@@ -921,6 +1790,7 @@
               <w:bottom w:w="60" w:type="dxa"/>
               <w:right w:w="100" w:type="dxa"/>
             </w:tcMar>
+            <w:vAlign w:val="center"/>
           </w:tcPr>
           <w:p>
             <w:r>
@@ -936,7 +1806,7 @@
         </w:tc>
         <w:tc>
           <w:tcPr>
-            <w:tcW w:w="6560" w:type="dxa"/>
+            <w:tcW w:w="0" w:type="auto"/>
             <w:tcBorders>
               <w:top w:val="single" w:sz="1" w:space="0" w:color="CCCCCC"/>
               <w:left w:val="single" w:sz="1" w:space="0" w:color="CCCCCC"/>
@@ -949,6 +1819,7 @@
               <w:bottom w:w="60" w:type="dxa"/>
               <w:right w:w="100" w:type="dxa"/>
             </w:tcMar>
+            <w:vAlign w:val="center"/>
           </w:tcPr>
           <w:p>
             <w:r>
@@ -956,15 +1827,41 @@
                 <w:sz w:val="17"/>
                 <w:szCs w:val="17"/>
               </w:rPr>
-              <w:t>86 commodities en 8 categorias</w:t>
+              <w:t xml:space="preserve">86 </w:t>
+            </w:r>
+            <w:proofErr w:type="spellStart"/>
+            <w:r>
+              <w:rPr>
+                <w:sz w:val="17"/>
+                <w:szCs w:val="17"/>
+              </w:rPr>
+              <w:t>commodities</w:t>
+            </w:r>
+            <w:proofErr w:type="spellEnd"/>
+            <w:r>
+              <w:rPr>
+                <w:sz w:val="17"/>
+                <w:szCs w:val="17"/>
+              </w:rPr>
+              <w:t xml:space="preserve"> en 8 </w:t>
+            </w:r>
+            <w:r>
+              <w:rPr>
+                <w:sz w:val="17"/>
+                <w:szCs w:val="17"/>
+              </w:rPr>
+              <w:t>categorías</w:t>
             </w:r>
           </w:p>
         </w:tc>
       </w:tr>
       <w:tr>
+        <w:trPr>
+          <w:jc w:val="center"/>
+        </w:trPr>
         <w:tc>
           <w:tcPr>
-            <w:tcW w:w="2800" w:type="dxa"/>
+            <w:tcW w:w="0" w:type="auto"/>
             <w:tcBorders>
               <w:top w:val="single" w:sz="1" w:space="0" w:color="CCCCCC"/>
               <w:left w:val="single" w:sz="1" w:space="0" w:color="CCCCCC"/>
@@ -978,6 +1875,7 @@
               <w:bottom w:w="60" w:type="dxa"/>
               <w:right w:w="100" w:type="dxa"/>
             </w:tcMar>
+            <w:vAlign w:val="center"/>
           </w:tcPr>
           <w:p>
             <w:r>
@@ -993,7 +1891,7 @@
         </w:tc>
         <w:tc>
           <w:tcPr>
-            <w:tcW w:w="6560" w:type="dxa"/>
+            <w:tcW w:w="0" w:type="auto"/>
             <w:tcBorders>
               <w:top w:val="single" w:sz="1" w:space="0" w:color="CCCCCC"/>
               <w:left w:val="single" w:sz="1" w:space="0" w:color="CCCCCC"/>
@@ -1007,6 +1905,7 @@
               <w:bottom w:w="60" w:type="dxa"/>
               <w:right w:w="100" w:type="dxa"/>
             </w:tcMar>
+            <w:vAlign w:val="center"/>
           </w:tcPr>
           <w:p>
             <w:r>
@@ -1014,15 +1913,34 @@
                 <w:sz w:val="17"/>
                 <w:szCs w:val="17"/>
               </w:rPr>
-              <w:t>0 (dataset completo)</w:t>
+              <w:t>0 (</w:t>
+            </w:r>
+            <w:proofErr w:type="spellStart"/>
+            <w:r>
+              <w:rPr>
+                <w:sz w:val="17"/>
+                <w:szCs w:val="17"/>
+              </w:rPr>
+              <w:t>dataset</w:t>
+            </w:r>
+            <w:proofErr w:type="spellEnd"/>
+            <w:r>
+              <w:rPr>
+                <w:sz w:val="17"/>
+                <w:szCs w:val="17"/>
+              </w:rPr>
+              <w:t xml:space="preserve"> completo)</w:t>
             </w:r>
           </w:p>
         </w:tc>
       </w:tr>
       <w:tr>
+        <w:trPr>
+          <w:jc w:val="center"/>
+        </w:trPr>
         <w:tc>
           <w:tcPr>
-            <w:tcW w:w="2800" w:type="dxa"/>
+            <w:tcW w:w="0" w:type="auto"/>
             <w:tcBorders>
               <w:top w:val="single" w:sz="1" w:space="0" w:color="CCCCCC"/>
               <w:left w:val="single" w:sz="1" w:space="0" w:color="CCCCCC"/>
@@ -1035,6 +1953,7 @@
               <w:bottom w:w="60" w:type="dxa"/>
               <w:right w:w="100" w:type="dxa"/>
             </w:tcMar>
+            <w:vAlign w:val="center"/>
           </w:tcPr>
           <w:p>
             <w:r>
@@ -1050,7 +1969,7 @@
         </w:tc>
         <w:tc>
           <w:tcPr>
-            <w:tcW w:w="6560" w:type="dxa"/>
+            <w:tcW w:w="0" w:type="auto"/>
             <w:tcBorders>
               <w:top w:val="single" w:sz="1" w:space="0" w:color="CCCCCC"/>
               <w:left w:val="single" w:sz="1" w:space="0" w:color="CCCCCC"/>
@@ -1063,6 +1982,7 @@
               <w:bottom w:w="60" w:type="dxa"/>
               <w:right w:w="100" w:type="dxa"/>
             </w:tcMar>
+            <w:vAlign w:val="center"/>
           </w:tcPr>
           <w:p>
             <w:r>
@@ -1092,13 +2012,31 @@
     <w:p>
       <w:pPr>
         <w:spacing w:after="60"/>
-      </w:pPr>
-      <w:r>
-        <w:rPr>
-          <w:sz w:val="19"/>
-          <w:szCs w:val="19"/>
-        </w:rPr>
-        <w:t>El dataset contiene 16 variables clasificadas en tres grupos funcionales:</w:t>
+        <w:rPr>
+          <w:sz w:val="22"/>
+          <w:szCs w:val="22"/>
+        </w:rPr>
+      </w:pPr>
+      <w:r>
+        <w:rPr>
+          <w:sz w:val="22"/>
+          <w:szCs w:val="22"/>
+        </w:rPr>
+        <w:t xml:space="preserve">El </w:t>
+      </w:r>
+      <w:r>
+        <w:rPr>
+          <w:sz w:val="22"/>
+          <w:szCs w:val="22"/>
+        </w:rPr>
+        <w:t>datase</w:t>
+      </w:r>
+      <w:r>
+        <w:rPr>
+          <w:sz w:val="22"/>
+          <w:szCs w:val="22"/>
+        </w:rPr>
+        <w:t xml:space="preserve"> contiene 16 variables clasificadas en tres grupos funcionales:</w:t>
       </w:r>
     </w:p>
     <w:p>
@@ -1109,22 +2047,107 @@
           <w:numId w:val="2"/>
         </w:numPr>
         <w:spacing w:after="50"/>
+        <w:jc w:val="both"/>
+        <w:rPr>
+          <w:sz w:val="22"/>
+          <w:szCs w:val="22"/>
+        </w:rPr>
       </w:pPr>
       <w:r>
         <w:rPr>
           <w:b/>
           <w:bCs/>
-          <w:sz w:val="19"/>
-          <w:szCs w:val="19"/>
-        </w:rPr>
-        <w:t xml:space="preserve">Variables de ubicacion (6): </w:t>
-      </w:r>
-      <w:r>
-        <w:rPr>
-          <w:sz w:val="19"/>
-          <w:szCs w:val="19"/>
-        </w:rPr>
-        <w:t>date (fecha mensual), admin1 (departamento), admin2 (municipio), market (nombre del mercado), latitude y longitude. Permiten analisis geografico y temporal.</w:t>
+          <w:sz w:val="22"/>
+          <w:szCs w:val="22"/>
+        </w:rPr>
+        <w:t xml:space="preserve">Variables de </w:t>
+      </w:r>
+      <w:r>
+        <w:rPr>
+          <w:b/>
+          <w:bCs/>
+          <w:sz w:val="22"/>
+          <w:szCs w:val="22"/>
+        </w:rPr>
+        <w:t>ubicación</w:t>
+      </w:r>
+      <w:r>
+        <w:rPr>
+          <w:b/>
+          <w:bCs/>
+          <w:sz w:val="22"/>
+          <w:szCs w:val="22"/>
+        </w:rPr>
+        <w:t xml:space="preserve"> (6): </w:t>
+      </w:r>
+      <w:r>
+        <w:rPr>
+          <w:sz w:val="22"/>
+          <w:szCs w:val="22"/>
+        </w:rPr>
+        <w:t xml:space="preserve">date (fecha mensual), admin1 (departamento), admin2 (municipio), </w:t>
+      </w:r>
+      <w:proofErr w:type="spellStart"/>
+      <w:r>
+        <w:rPr>
+          <w:sz w:val="22"/>
+          <w:szCs w:val="22"/>
+        </w:rPr>
+        <w:t>market</w:t>
+      </w:r>
+      <w:proofErr w:type="spellEnd"/>
+      <w:r>
+        <w:rPr>
+          <w:sz w:val="22"/>
+          <w:szCs w:val="22"/>
+        </w:rPr>
+        <w:t xml:space="preserve"> (nombre del </w:t>
+      </w:r>
+      <w:r>
+        <w:rPr>
+          <w:sz w:val="22"/>
+          <w:szCs w:val="22"/>
+        </w:rPr>
+        <w:t xml:space="preserve">departamento donde se vende como </w:t>
+      </w:r>
+      <w:r>
+        <w:rPr>
+          <w:sz w:val="22"/>
+          <w:szCs w:val="22"/>
+        </w:rPr>
+        <w:t xml:space="preserve">mercado), </w:t>
+      </w:r>
+      <w:proofErr w:type="spellStart"/>
+      <w:r>
+        <w:rPr>
+          <w:sz w:val="22"/>
+          <w:szCs w:val="22"/>
+        </w:rPr>
+        <w:t>latitude</w:t>
+      </w:r>
+      <w:proofErr w:type="spellEnd"/>
+      <w:r>
+        <w:rPr>
+          <w:sz w:val="22"/>
+          <w:szCs w:val="22"/>
+        </w:rPr>
+        <w:t xml:space="preserve"> y </w:t>
+      </w:r>
+      <w:proofErr w:type="spellStart"/>
+      <w:r>
+        <w:rPr>
+          <w:sz w:val="22"/>
+          <w:szCs w:val="22"/>
+        </w:rPr>
+        <w:t>longitude</w:t>
+      </w:r>
+      <w:proofErr w:type="spellEnd"/>
+      <w:r>
+        <w:rPr>
+          <w:sz w:val="22"/>
+          <w:szCs w:val="22"/>
+        </w:rPr>
+        <w:t>.</w:t>
       </w:r>
     </w:p>
     <w:p>
@@ -1135,22 +2158,116 @@
           <w:numId w:val="2"/>
         </w:numPr>
         <w:spacing w:after="50"/>
+        <w:jc w:val="both"/>
+        <w:rPr>
+          <w:sz w:val="22"/>
+          <w:szCs w:val="22"/>
+        </w:rPr>
       </w:pPr>
       <w:r>
         <w:rPr>
           <w:b/>
           <w:bCs/>
-          <w:sz w:val="19"/>
-          <w:szCs w:val="19"/>
+          <w:sz w:val="22"/>
+          <w:szCs w:val="22"/>
         </w:rPr>
         <w:t xml:space="preserve">Variables del producto (5): </w:t>
       </w:r>
-      <w:r>
-        <w:rPr>
-          <w:sz w:val="19"/>
-          <w:szCs w:val="19"/>
-        </w:rPr>
-        <w:t>category (8 categorias alimentarias), commodity (86 productos), commodity_id, unit (KG, L, unidad) y market_id.</w:t>
+      <w:proofErr w:type="spellStart"/>
+      <w:r>
+        <w:rPr>
+          <w:sz w:val="22"/>
+          <w:szCs w:val="22"/>
+        </w:rPr>
+        <w:t>category</w:t>
+      </w:r>
+      <w:proofErr w:type="spellEnd"/>
+      <w:r>
+        <w:rPr>
+          <w:sz w:val="22"/>
+          <w:szCs w:val="22"/>
+        </w:rPr>
+        <w:t xml:space="preserve"> (8 </w:t>
+      </w:r>
+      <w:proofErr w:type="spellStart"/>
+      <w:r>
+        <w:rPr>
+          <w:sz w:val="22"/>
+          <w:szCs w:val="22"/>
+        </w:rPr>
+        <w:t>categorias</w:t>
+      </w:r>
+      <w:proofErr w:type="spellEnd"/>
+      <w:r>
+        <w:rPr>
+          <w:sz w:val="22"/>
+          <w:szCs w:val="22"/>
+        </w:rPr>
+        <w:t xml:space="preserve"> alimentarias), </w:t>
+      </w:r>
+      <w:proofErr w:type="spellStart"/>
+      <w:r>
+        <w:rPr>
+          <w:sz w:val="22"/>
+          <w:szCs w:val="22"/>
+        </w:rPr>
+        <w:t>commodity</w:t>
+      </w:r>
+      <w:proofErr w:type="spellEnd"/>
+      <w:r>
+        <w:rPr>
+          <w:sz w:val="22"/>
+          <w:szCs w:val="22"/>
+        </w:rPr>
+        <w:t xml:space="preserve"> (86 productos), </w:t>
+      </w:r>
+      <w:proofErr w:type="spellStart"/>
+      <w:r>
+        <w:rPr>
+          <w:sz w:val="22"/>
+          <w:szCs w:val="22"/>
+        </w:rPr>
+        <w:t>commodity_id</w:t>
+      </w:r>
+      <w:proofErr w:type="spellEnd"/>
+      <w:r>
+        <w:rPr>
+          <w:sz w:val="22"/>
+          <w:szCs w:val="22"/>
+        </w:rPr>
+        <w:t xml:space="preserve">, </w:t>
+      </w:r>
+      <w:proofErr w:type="spellStart"/>
+      <w:r>
+        <w:rPr>
+          <w:sz w:val="22"/>
+          <w:szCs w:val="22"/>
+        </w:rPr>
+        <w:t>unit</w:t>
+      </w:r>
+      <w:proofErr w:type="spellEnd"/>
+      <w:r>
+        <w:rPr>
+          <w:sz w:val="22"/>
+          <w:szCs w:val="22"/>
+        </w:rPr>
+        <w:t xml:space="preserve"> (KG, L, unidad) y </w:t>
+      </w:r>
+      <w:proofErr w:type="spellStart"/>
+      <w:r>
+        <w:rPr>
+          <w:sz w:val="22"/>
+          <w:szCs w:val="22"/>
+        </w:rPr>
+        <w:t>market_id</w:t>
+      </w:r>
+      <w:proofErr w:type="spellEnd"/>
+      <w:r>
+        <w:rPr>
+          <w:sz w:val="22"/>
+          <w:szCs w:val="22"/>
+        </w:rPr>
+        <w:t>.</w:t>
       </w:r>
     </w:p>
     <w:p>
@@ -1161,22 +2278,114 @@
           <w:numId w:val="2"/>
         </w:numPr>
         <w:spacing w:after="80"/>
+        <w:jc w:val="both"/>
+        <w:rPr>
+          <w:sz w:val="22"/>
+          <w:szCs w:val="22"/>
+        </w:rPr>
       </w:pPr>
       <w:r>
         <w:rPr>
           <w:b/>
           <w:bCs/>
-          <w:sz w:val="19"/>
-          <w:szCs w:val="19"/>
+          <w:sz w:val="22"/>
+          <w:szCs w:val="22"/>
         </w:rPr>
         <w:t xml:space="preserve">Variables de precio (5): </w:t>
       </w:r>
-      <w:r>
-        <w:rPr>
-          <w:sz w:val="19"/>
-          <w:szCs w:val="19"/>
-        </w:rPr>
-        <w:t>priceflag (actual/agregado), pricetype (mayorista/minorista), currency (COP), price (precio en COP) y usdprice (equivalente USD). Son las variables centrales del analisis.</w:t>
+      <w:proofErr w:type="spellStart"/>
+      <w:r>
+        <w:rPr>
+          <w:sz w:val="22"/>
+          <w:szCs w:val="22"/>
+        </w:rPr>
+        <w:t>priceflag</w:t>
+      </w:r>
+      <w:proofErr w:type="spellEnd"/>
+      <w:r>
+        <w:rPr>
+          <w:sz w:val="22"/>
+          <w:szCs w:val="22"/>
+        </w:rPr>
+        <w:t xml:space="preserve"> (actual/agregado), </w:t>
+      </w:r>
+      <w:proofErr w:type="spellStart"/>
+      <w:r>
+        <w:rPr>
+          <w:sz w:val="22"/>
+          <w:szCs w:val="22"/>
+        </w:rPr>
+        <w:t>pricetype</w:t>
+      </w:r>
+      <w:proofErr w:type="spellEnd"/>
+      <w:r>
+        <w:rPr>
+          <w:sz w:val="22"/>
+          <w:szCs w:val="22"/>
+        </w:rPr>
+        <w:t xml:space="preserve"> (mayorista/minorista), </w:t>
+      </w:r>
+      <w:proofErr w:type="spellStart"/>
+      <w:r>
+        <w:rPr>
+          <w:sz w:val="22"/>
+          <w:szCs w:val="22"/>
+        </w:rPr>
+        <w:t>currency</w:t>
+      </w:r>
+      <w:proofErr w:type="spellEnd"/>
+      <w:r>
+        <w:rPr>
+          <w:sz w:val="22"/>
+          <w:szCs w:val="22"/>
+        </w:rPr>
+        <w:t xml:space="preserve"> (COP), </w:t>
+      </w:r>
+      <w:proofErr w:type="spellStart"/>
+      <w:r>
+        <w:rPr>
+          <w:sz w:val="22"/>
+          <w:szCs w:val="22"/>
+        </w:rPr>
+        <w:t>price</w:t>
+      </w:r>
+      <w:proofErr w:type="spellEnd"/>
+      <w:r>
+        <w:rPr>
+          <w:sz w:val="22"/>
+          <w:szCs w:val="22"/>
+        </w:rPr>
+        <w:t xml:space="preserve"> (precio en COP) y </w:t>
+      </w:r>
+      <w:proofErr w:type="spellStart"/>
+      <w:r>
+        <w:rPr>
+          <w:sz w:val="22"/>
+          <w:szCs w:val="22"/>
+        </w:rPr>
+        <w:t>usdprice</w:t>
+      </w:r>
+      <w:proofErr w:type="spellEnd"/>
+      <w:r>
+        <w:rPr>
+          <w:sz w:val="22"/>
+          <w:szCs w:val="22"/>
+        </w:rPr>
+        <w:t xml:space="preserve"> (equivalente USD). Son las variables </w:t>
+      </w:r>
+      <w:r>
+        <w:rPr>
+          <w:sz w:val="22"/>
+          <w:szCs w:val="22"/>
+        </w:rPr>
+        <w:t>de interés para el análisis</w:t>
+      </w:r>
+      <w:r>
+        <w:rPr>
+          <w:sz w:val="22"/>
+          <w:szCs w:val="22"/>
+        </w:rPr>
+        <w:t>.</w:t>
       </w:r>
     </w:p>
     <w:p>
@@ -1184,7 +2393,10 @@
         <w:pStyle w:val="Ttulo2"/>
       </w:pPr>
       <w:r>
-        <w:t>Categorias de alimentos</w:t>
+        <w:t>Categorías</w:t>
+      </w:r>
+      <w:r>
+        <w:t xml:space="preserve"> de alimentos</w:t>
       </w:r>
     </w:p>
     <w:tbl>
@@ -1236,7 +2448,7 @@
                 <w:sz w:val="18"/>
                 <w:szCs w:val="18"/>
               </w:rPr>
-              <w:t>Categoria</w:t>
+              <w:t>Categoría</w:t>
             </w:r>
           </w:p>
         </w:tc>
@@ -1295,7 +2507,14 @@
                 <w:sz w:val="17"/>
                 <w:szCs w:val="17"/>
               </w:rPr>
-              <w:t>Cereales y tuberculos</w:t>
+              <w:t xml:space="preserve">Cereales y </w:t>
+            </w:r>
+            <w:r>
+              <w:rPr>
+                <w:sz w:val="17"/>
+                <w:szCs w:val="17"/>
+              </w:rPr>
+              <w:t>tubérculos</w:t>
             </w:r>
           </w:p>
         </w:tc>
@@ -1321,7 +2540,28 @@
                 <w:sz w:val="17"/>
                 <w:szCs w:val="17"/>
               </w:rPr>
-              <w:t>Arroz, maiz, trigo, papa, yuca, platano</w:t>
+              <w:t xml:space="preserve">Arroz, </w:t>
+            </w:r>
+            <w:r>
+              <w:rPr>
+                <w:sz w:val="17"/>
+                <w:szCs w:val="17"/>
+              </w:rPr>
+              <w:t>maíz</w:t>
+            </w:r>
+            <w:r>
+              <w:rPr>
+                <w:sz w:val="17"/>
+                <w:szCs w:val="17"/>
+              </w:rPr>
+              <w:t xml:space="preserve">, trigo, papa, yuca, </w:t>
+            </w:r>
+            <w:r>
+              <w:rPr>
+                <w:sz w:val="17"/>
+                <w:szCs w:val="17"/>
+              </w:rPr>
+              <w:t>plátano</w:t>
             </w:r>
           </w:p>
         </w:tc>
@@ -1405,7 +2645,14 @@
                 <w:sz w:val="17"/>
                 <w:szCs w:val="17"/>
               </w:rPr>
-              <w:t>Leche y lacteos</w:t>
+              <w:t xml:space="preserve">Leche y </w:t>
+            </w:r>
+            <w:r>
+              <w:rPr>
+                <w:sz w:val="17"/>
+                <w:szCs w:val="17"/>
+              </w:rPr>
+              <w:t>lácteos</w:t>
             </w:r>
           </w:p>
         </w:tc>
@@ -1620,6 +2867,7 @@
             </w:tcMar>
           </w:tcPr>
           <w:p>
+            <w:proofErr w:type="spellStart"/>
             <w:r>
               <w:rPr>
                 <w:sz w:val="17"/>
@@ -1627,6 +2875,7 @@
               </w:rPr>
               <w:t>Miscelaneos</w:t>
             </w:r>
+            <w:proofErr w:type="spellEnd"/>
           </w:p>
         </w:tc>
         <w:tc>
@@ -1651,7 +2900,28 @@
                 <w:sz w:val="17"/>
                 <w:szCs w:val="17"/>
               </w:rPr>
-              <w:t>Azucar, sal, cafe, cacao, pasta</w:t>
+              <w:t>Azúcar</w:t>
+            </w:r>
+            <w:r>
+              <w:rPr>
+                <w:sz w:val="17"/>
+                <w:szCs w:val="17"/>
+              </w:rPr>
+              <w:t xml:space="preserve">, sal, </w:t>
+            </w:r>
+            <w:r>
+              <w:rPr>
+                <w:sz w:val="17"/>
+                <w:szCs w:val="17"/>
+              </w:rPr>
+              <w:t>café</w:t>
+            </w:r>
+            <w:r>
+              <w:rPr>
+                <w:sz w:val="17"/>
+                <w:szCs w:val="17"/>
+              </w:rPr>
+              <w:t>, cacao, pasta</w:t>
             </w:r>
           </w:p>
         </w:tc>
@@ -1723,19 +2993,61 @@
         <w:pStyle w:val="Ttulo1"/>
       </w:pPr>
       <w:r>
-        <w:t>5. Hipotesis Analiticas</w:t>
+        <w:lastRenderedPageBreak/>
+        <w:t xml:space="preserve">5. </w:t>
+      </w:r>
+      <w:r>
+        <w:t>Hipótesis</w:t>
+      </w:r>
+      <w:r>
+        <w:t xml:space="preserve"> </w:t>
+      </w:r>
+      <w:r>
+        <w:t>Analíticas</w:t>
       </w:r>
     </w:p>
     <w:p>
       <w:pPr>
         <w:spacing w:after="80"/>
-      </w:pPr>
-      <w:r>
-        <w:rPr>
-          <w:sz w:val="19"/>
-          <w:szCs w:val="19"/>
-        </w:rPr>
-        <w:t>A partir de la pregunta de negocio, se plantean las siguientes hipotesis que guiaran la exploracion visual en las entregas posteriores:</w:t>
+        <w:rPr>
+          <w:sz w:val="22"/>
+          <w:szCs w:val="22"/>
+        </w:rPr>
+      </w:pPr>
+      <w:r>
+        <w:rPr>
+          <w:sz w:val="22"/>
+          <w:szCs w:val="22"/>
+        </w:rPr>
+        <w:t xml:space="preserve">A partir de la pregunta de negocio, se plantean las siguientes </w:t>
+      </w:r>
+      <w:r>
+        <w:rPr>
+          <w:sz w:val="22"/>
+          <w:szCs w:val="22"/>
+        </w:rPr>
+        <w:t>hipótesis</w:t>
+      </w:r>
+      <w:r>
+        <w:rPr>
+          <w:sz w:val="22"/>
+          <w:szCs w:val="22"/>
+        </w:rPr>
+        <w:t xml:space="preserve"> que guiaran la </w:t>
+      </w:r>
+      <w:r>
+        <w:rPr>
+          <w:sz w:val="22"/>
+          <w:szCs w:val="22"/>
+        </w:rPr>
+        <w:t>exploración</w:t>
+      </w:r>
+      <w:r>
+        <w:rPr>
+          <w:sz w:val="22"/>
+          <w:szCs w:val="22"/>
+        </w:rPr>
+        <w:t xml:space="preserve"> visual en las entregas posteriores:</w:t>
       </w:r>
     </w:p>
     <w:p>
@@ -1746,22 +3058,111 @@
           <w:numId w:val="2"/>
         </w:numPr>
         <w:spacing w:after="60"/>
+        <w:jc w:val="both"/>
+        <w:rPr>
+          <w:sz w:val="22"/>
+          <w:szCs w:val="22"/>
+        </w:rPr>
       </w:pPr>
       <w:r>
         <w:rPr>
           <w:b/>
           <w:bCs/>
-          <w:sz w:val="19"/>
-          <w:szCs w:val="19"/>
+          <w:sz w:val="22"/>
+          <w:szCs w:val="22"/>
         </w:rPr>
         <w:t xml:space="preserve">H1 (Tendencia temporal): </w:t>
       </w:r>
       <w:r>
         <w:rPr>
-          <w:sz w:val="19"/>
-          <w:szCs w:val="19"/>
-        </w:rPr>
-        <w:t>Los precios de alimentos basicos (arroz, maiz, papa) han mostrado una tendencia creciente sostenida en COP, con periodos de alta volatilidad asociados a fenomenos climaticos (El Nino/La Nina) y crisis economicas (COVID-19, devaluacion del peso).</w:t>
+          <w:sz w:val="22"/>
+          <w:szCs w:val="22"/>
+        </w:rPr>
+        <w:t xml:space="preserve">Los precios de alimentos </w:t>
+      </w:r>
+      <w:r>
+        <w:rPr>
+          <w:sz w:val="22"/>
+          <w:szCs w:val="22"/>
+        </w:rPr>
+        <w:t>básicos</w:t>
+      </w:r>
+      <w:r>
+        <w:rPr>
+          <w:sz w:val="22"/>
+          <w:szCs w:val="22"/>
+        </w:rPr>
+        <w:t xml:space="preserve"> (arroz, </w:t>
+      </w:r>
+      <w:r>
+        <w:rPr>
+          <w:sz w:val="22"/>
+          <w:szCs w:val="22"/>
+        </w:rPr>
+        <w:t>maíz</w:t>
+      </w:r>
+      <w:r>
+        <w:rPr>
+          <w:sz w:val="22"/>
+          <w:szCs w:val="22"/>
+        </w:rPr>
+        <w:t xml:space="preserve">, papa) han mostrado una tendencia creciente sostenida en COP, con periodos de alta volatilidad asociados a </w:t>
+      </w:r>
+      <w:r>
+        <w:rPr>
+          <w:sz w:val="22"/>
+          <w:szCs w:val="22"/>
+        </w:rPr>
+        <w:t>fenómenos</w:t>
+      </w:r>
+      <w:r>
+        <w:rPr>
+          <w:sz w:val="22"/>
+          <w:szCs w:val="22"/>
+        </w:rPr>
+        <w:t xml:space="preserve"> </w:t>
+      </w:r>
+      <w:r>
+        <w:rPr>
+          <w:sz w:val="22"/>
+          <w:szCs w:val="22"/>
+        </w:rPr>
+        <w:t>climáticos</w:t>
+      </w:r>
+      <w:r>
+        <w:rPr>
+          <w:sz w:val="22"/>
+          <w:szCs w:val="22"/>
+        </w:rPr>
+        <w:t xml:space="preserve"> (El Nino/La Nina) y crisis </w:t>
+      </w:r>
+      <w:r>
+        <w:rPr>
+          <w:sz w:val="22"/>
+          <w:szCs w:val="22"/>
+        </w:rPr>
+        <w:t>económicas</w:t>
+      </w:r>
+      <w:r>
+        <w:rPr>
+          <w:sz w:val="22"/>
+          <w:szCs w:val="22"/>
+        </w:rPr>
+        <w:t xml:space="preserve"> (COVID-19, </w:t>
+      </w:r>
+      <w:r>
+        <w:rPr>
+          <w:sz w:val="22"/>
+          <w:szCs w:val="22"/>
+        </w:rPr>
+        <w:t>devaluación</w:t>
+      </w:r>
+      <w:r>
+        <w:rPr>
+          <w:sz w:val="22"/>
+          <w:szCs w:val="22"/>
+        </w:rPr>
+        <w:t xml:space="preserve"> del peso).</w:t>
       </w:r>
     </w:p>
     <w:p>
@@ -1772,22 +3173,55 @@
           <w:numId w:val="2"/>
         </w:numPr>
         <w:spacing w:after="60"/>
+        <w:jc w:val="both"/>
+        <w:rPr>
+          <w:sz w:val="22"/>
+          <w:szCs w:val="22"/>
+        </w:rPr>
       </w:pPr>
       <w:r>
         <w:rPr>
           <w:b/>
           <w:bCs/>
-          <w:sz w:val="19"/>
-          <w:szCs w:val="19"/>
+          <w:sz w:val="22"/>
+          <w:szCs w:val="22"/>
         </w:rPr>
         <w:t xml:space="preserve">H2 (Disparidad regional): </w:t>
       </w:r>
       <w:r>
         <w:rPr>
-          <w:sz w:val="19"/>
-          <w:szCs w:val="19"/>
-        </w:rPr>
-        <w:t>Existen diferencias significativas de precios entre mercados del interior (Bogota, Medellin) y mercados perifericos (Buenaventura, Florencia), reflejando costos de transporte y acceso a cadenas de suministro.</w:t>
+          <w:sz w:val="22"/>
+          <w:szCs w:val="22"/>
+        </w:rPr>
+        <w:t>Existen diferencias significativas de precios entre mercados del interior (</w:t>
+      </w:r>
+      <w:r>
+        <w:rPr>
+          <w:sz w:val="22"/>
+          <w:szCs w:val="22"/>
+        </w:rPr>
+        <w:t>Bogotá</w:t>
+      </w:r>
+      <w:r>
+        <w:rPr>
+          <w:sz w:val="22"/>
+          <w:szCs w:val="22"/>
+        </w:rPr>
+        <w:t xml:space="preserve">, Medellin) y mercados </w:t>
+      </w:r>
+      <w:r>
+        <w:rPr>
+          <w:sz w:val="22"/>
+          <w:szCs w:val="22"/>
+        </w:rPr>
+        <w:t>periféricos</w:t>
+      </w:r>
+      <w:r>
+        <w:rPr>
+          <w:sz w:val="22"/>
+          <w:szCs w:val="22"/>
+        </w:rPr>
+        <w:t xml:space="preserve"> (Buenaventura, Florencia), reflejando costos de transporte y acceso a cadenas de suministro.</w:t>
       </w:r>
     </w:p>
     <w:p>
@@ -1798,22 +3232,55 @@
           <w:numId w:val="2"/>
         </w:numPr>
         <w:spacing w:after="60"/>
+        <w:jc w:val="both"/>
+        <w:rPr>
+          <w:sz w:val="22"/>
+          <w:szCs w:val="22"/>
+        </w:rPr>
       </w:pPr>
       <w:r>
         <w:rPr>
           <w:b/>
           <w:bCs/>
-          <w:sz w:val="19"/>
-          <w:szCs w:val="19"/>
+          <w:sz w:val="22"/>
+          <w:szCs w:val="22"/>
         </w:rPr>
         <w:t xml:space="preserve">H3 (Estacionalidad): </w:t>
       </w:r>
       <w:r>
         <w:rPr>
-          <w:sz w:val="19"/>
-          <w:szCs w:val="19"/>
-        </w:rPr>
-        <w:t>Las frutas y verduras presentan ciclos estacionales mas pronunciados que los cereales, con picos de precio en meses especificos que se repiten anualmente.</w:t>
+          <w:sz w:val="22"/>
+          <w:szCs w:val="22"/>
+        </w:rPr>
+        <w:t xml:space="preserve">Las frutas y verduras presentan ciclos estacionales </w:t>
+      </w:r>
+      <w:r>
+        <w:rPr>
+          <w:sz w:val="22"/>
+          <w:szCs w:val="22"/>
+        </w:rPr>
+        <w:t>más</w:t>
+      </w:r>
+      <w:r>
+        <w:rPr>
+          <w:sz w:val="22"/>
+          <w:szCs w:val="22"/>
+        </w:rPr>
+        <w:t xml:space="preserve"> pronunciados que los cereales, con picos de precio en meses </w:t>
+      </w:r>
+      <w:r>
+        <w:rPr>
+          <w:sz w:val="22"/>
+          <w:szCs w:val="22"/>
+        </w:rPr>
+        <w:t>específicos</w:t>
+      </w:r>
+      <w:r>
+        <w:rPr>
+          <w:sz w:val="22"/>
+          <w:szCs w:val="22"/>
+        </w:rPr>
+        <w:t xml:space="preserve"> que se repiten anualmente.</w:t>
       </w:r>
     </w:p>
     <w:p>
@@ -1824,22 +3291,69 @@
           <w:numId w:val="2"/>
         </w:numPr>
         <w:spacing w:after="60"/>
+        <w:jc w:val="both"/>
+        <w:rPr>
+          <w:sz w:val="22"/>
+          <w:szCs w:val="22"/>
+        </w:rPr>
       </w:pPr>
       <w:r>
         <w:rPr>
           <w:b/>
           <w:bCs/>
-          <w:sz w:val="19"/>
-          <w:szCs w:val="19"/>
+          <w:sz w:val="22"/>
+          <w:szCs w:val="22"/>
         </w:rPr>
         <w:t xml:space="preserve">H4 (Mayorista vs. minorista): </w:t>
       </w:r>
       <w:r>
         <w:rPr>
-          <w:sz w:val="19"/>
-          <w:szCs w:val="19"/>
-        </w:rPr>
-        <w:t>La brecha entre precios mayoristas y minoristas varia significativamente por categoria de producto y region, indicando diferencias en la eficiencia de las cadenas de distribucion.</w:t>
+          <w:sz w:val="22"/>
+          <w:szCs w:val="22"/>
+        </w:rPr>
+        <w:t xml:space="preserve">La brecha entre precios mayoristas y minoristas varia significativamente por </w:t>
+      </w:r>
+      <w:r>
+        <w:rPr>
+          <w:sz w:val="22"/>
+          <w:szCs w:val="22"/>
+        </w:rPr>
+        <w:t>categoría</w:t>
+      </w:r>
+      <w:r>
+        <w:rPr>
+          <w:sz w:val="22"/>
+          <w:szCs w:val="22"/>
+        </w:rPr>
+        <w:t xml:space="preserve"> de producto y </w:t>
+      </w:r>
+      <w:r>
+        <w:rPr>
+          <w:sz w:val="22"/>
+          <w:szCs w:val="22"/>
+        </w:rPr>
+        <w:t>región</w:t>
+      </w:r>
+      <w:r>
+        <w:rPr>
+          <w:sz w:val="22"/>
+          <w:szCs w:val="22"/>
+        </w:rPr>
+        <w:t xml:space="preserve">, indicando diferencias en la eficiencia de las cadenas de </w:t>
+      </w:r>
+      <w:r>
+        <w:rPr>
+          <w:sz w:val="22"/>
+          <w:szCs w:val="22"/>
+        </w:rPr>
+        <w:t>distribución</w:t>
+      </w:r>
+      <w:r>
+        <w:rPr>
+          <w:sz w:val="22"/>
+          <w:szCs w:val="22"/>
+        </w:rPr>
+        <w:t>.</w:t>
       </w:r>
     </w:p>
     <w:p>
@@ -1850,22 +3364,85 @@
           <w:numId w:val="2"/>
         </w:numPr>
         <w:spacing w:after="120"/>
+        <w:jc w:val="both"/>
+        <w:rPr>
+          <w:sz w:val="22"/>
+          <w:szCs w:val="22"/>
+        </w:rPr>
       </w:pPr>
       <w:r>
         <w:rPr>
           <w:b/>
           <w:bCs/>
-          <w:sz w:val="19"/>
-          <w:szCs w:val="19"/>
+          <w:sz w:val="22"/>
+          <w:szCs w:val="22"/>
         </w:rPr>
         <w:t xml:space="preserve">H5 (Impacto cambiario): </w:t>
       </w:r>
       <w:r>
         <w:rPr>
-          <w:sz w:val="19"/>
-          <w:szCs w:val="19"/>
-        </w:rPr>
-        <w:t>La comparacion entre precios en COP y USD revela que productos importados (trigo, lentejas) son mas sensibles a la tasa de cambio que productos de produccion local (yuca, platano).</w:t>
+          <w:sz w:val="22"/>
+          <w:szCs w:val="22"/>
+        </w:rPr>
+        <w:t xml:space="preserve">La </w:t>
+      </w:r>
+      <w:r>
+        <w:rPr>
+          <w:sz w:val="22"/>
+          <w:szCs w:val="22"/>
+        </w:rPr>
+        <w:t>comparación</w:t>
+      </w:r>
+      <w:r>
+        <w:rPr>
+          <w:sz w:val="22"/>
+          <w:szCs w:val="22"/>
+        </w:rPr>
+        <w:t xml:space="preserve"> entre precios en COP y USD revela que productos importados (trigo, lentejas) son </w:t>
+      </w:r>
+      <w:proofErr w:type="spellStart"/>
+      <w:r>
+        <w:rPr>
+          <w:sz w:val="22"/>
+          <w:szCs w:val="22"/>
+        </w:rPr>
+        <w:t>mas</w:t>
+      </w:r>
+      <w:proofErr w:type="spellEnd"/>
+      <w:r>
+        <w:rPr>
+          <w:sz w:val="22"/>
+          <w:szCs w:val="22"/>
+        </w:rPr>
+        <w:t xml:space="preserve"> sensibles a la tasa de cambio que productos de </w:t>
+      </w:r>
+      <w:r>
+        <w:rPr>
+          <w:sz w:val="22"/>
+          <w:szCs w:val="22"/>
+        </w:rPr>
+        <w:t>producción</w:t>
+      </w:r>
+      <w:r>
+        <w:rPr>
+          <w:sz w:val="22"/>
+          <w:szCs w:val="22"/>
+        </w:rPr>
+        <w:t xml:space="preserve"> local (yuca, </w:t>
+      </w:r>
+      <w:r>
+        <w:rPr>
+          <w:sz w:val="22"/>
+          <w:szCs w:val="22"/>
+        </w:rPr>
+        <w:t>plátano</w:t>
+      </w:r>
+      <w:r>
+        <w:rPr>
+          <w:sz w:val="22"/>
+          <w:szCs w:val="22"/>
+        </w:rPr>
+        <w:t>).</w:t>
       </w:r>
     </w:p>
     <w:p>
@@ -1873,35 +3450,79 @@
         <w:pStyle w:val="Ttulo1"/>
       </w:pPr>
       <w:r>
-        <w:t>6. Enfoque de Visualizacion Propuesto</w:t>
+        <w:t xml:space="preserve">6. Enfoque de </w:t>
+      </w:r>
+      <w:r>
+        <w:t>Visualización</w:t>
+      </w:r>
+      <w:r>
+        <w:t xml:space="preserve"> Propuesto</w:t>
       </w:r>
     </w:p>
     <w:p>
       <w:pPr>
-        <w:spacing w:after="80"/>
-      </w:pPr>
-      <w:r>
-        <w:rPr>
-          <w:sz w:val="19"/>
-          <w:szCs w:val="19"/>
-        </w:rPr>
-        <w:t xml:space="preserve">El proyecto utilizara </w:t>
-      </w:r>
-      <w:r>
-        <w:rPr>
-          <w:b/>
-          <w:bCs/>
-          <w:sz w:val="19"/>
-          <w:szCs w:val="19"/>
-        </w:rPr>
-        <w:t>Altair/Vega-Lite</w:t>
-      </w:r>
-      <w:r>
-        <w:rPr>
-          <w:sz w:val="19"/>
-          <w:szCs w:val="19"/>
-        </w:rPr>
-        <w:t xml:space="preserve"> como herramienta principal de visualizacion, consistente con lo visto en el curso (Sesiones 2 y 3). Se aplicaran:</w:t>
+        <w:spacing w:after="100"/>
+        <w:jc w:val="both"/>
+        <w:rPr>
+          <w:sz w:val="22"/>
+          <w:szCs w:val="22"/>
+        </w:rPr>
+      </w:pPr>
+      <w:r>
+        <w:rPr>
+          <w:sz w:val="22"/>
+          <w:szCs w:val="22"/>
+        </w:rPr>
+        <w:t xml:space="preserve">El proyecto empleará el lenguaje Python para realizar una exploración inicial de los datos mediante visualizaciones que permitan evaluar las hipótesis propuestas, así como identificar nuevas relaciones que puedan emerger durante esta fase analítica. Para ello, se utilizarán librerías de visualización como </w:t>
+      </w:r>
+      <w:proofErr w:type="spellStart"/>
+      <w:r>
+        <w:rPr>
+          <w:sz w:val="22"/>
+          <w:szCs w:val="22"/>
+        </w:rPr>
+        <w:t>Plotly</w:t>
+      </w:r>
+      <w:proofErr w:type="spellEnd"/>
+      <w:r>
+        <w:rPr>
+          <w:sz w:val="22"/>
+          <w:szCs w:val="22"/>
+        </w:rPr>
+        <w:t xml:space="preserve">, Seaborn, </w:t>
+      </w:r>
+      <w:proofErr w:type="spellStart"/>
+      <w:r>
+        <w:rPr>
+          <w:sz w:val="22"/>
+          <w:szCs w:val="22"/>
+        </w:rPr>
+        <w:t>Go</w:t>
+      </w:r>
+      <w:proofErr w:type="spellEnd"/>
+      <w:r>
+        <w:rPr>
+          <w:sz w:val="22"/>
+          <w:szCs w:val="22"/>
+        </w:rPr>
+        <w:t xml:space="preserve"> y/o Altair/Vega-Lite, en coherencia con los enfoques estudiados en el curso.</w:t>
+      </w:r>
+    </w:p>
+    <w:p>
+      <w:pPr>
+        <w:spacing w:after="100"/>
+        <w:jc w:val="both"/>
+        <w:rPr>
+          <w:sz w:val="22"/>
+          <w:szCs w:val="22"/>
+        </w:rPr>
+      </w:pPr>
+      <w:r>
+        <w:rPr>
+          <w:sz w:val="22"/>
+          <w:szCs w:val="22"/>
+        </w:rPr>
+        <w:t>Se aplicarán los siguientes principios de visualización:</w:t>
       </w:r>
     </w:p>
     <w:p>
@@ -1909,25 +3530,44 @@
         <w:pStyle w:val="Prrafodelista"/>
         <w:numPr>
           <w:ilvl w:val="0"/>
-          <w:numId w:val="2"/>
+          <w:numId w:val="3"/>
         </w:numPr>
-        <w:spacing w:after="50"/>
+        <w:spacing w:after="100"/>
+        <w:jc w:val="both"/>
+        <w:rPr>
+          <w:sz w:val="22"/>
+          <w:szCs w:val="22"/>
+        </w:rPr>
       </w:pPr>
       <w:r>
         <w:rPr>
           <w:b/>
           <w:bCs/>
-          <w:sz w:val="19"/>
-          <w:szCs w:val="19"/>
-        </w:rPr>
-        <w:t xml:space="preserve">Principios de Tufte: </w:t>
-      </w:r>
-      <w:r>
-        <w:rPr>
-          <w:sz w:val="19"/>
-          <w:szCs w:val="19"/>
-        </w:rPr>
-        <w:t>Maximizar el ratio datos-tinta, eliminar chartjunk, usar small multiples para comparaciones.</w:t>
+          <w:sz w:val="22"/>
+          <w:szCs w:val="22"/>
+        </w:rPr>
+        <w:t>Gramática de gráficos:</w:t>
+      </w:r>
+      <w:r>
+        <w:rPr>
+          <w:sz w:val="22"/>
+          <w:szCs w:val="22"/>
+        </w:rPr>
+        <w:t xml:space="preserve"> uso sistemático de </w:t>
+      </w:r>
+      <w:r>
+        <w:rPr>
+          <w:sz w:val="22"/>
+          <w:szCs w:val="22"/>
+        </w:rPr>
+        <w:t>codificaciones</w:t>
+      </w:r>
+      <w:r>
+        <w:rPr>
+          <w:sz w:val="22"/>
+          <w:szCs w:val="22"/>
+        </w:rPr>
+        <w:t xml:space="preserve"> visuales (posición, color y tamaño), respetando la jerarquía de efectividad perceptual para maximizar la claridad interpretativa.</w:t>
       </w:r>
     </w:p>
     <w:p>
@@ -1935,25 +3575,60 @@
         <w:pStyle w:val="Prrafodelista"/>
         <w:numPr>
           <w:ilvl w:val="0"/>
-          <w:numId w:val="2"/>
+          <w:numId w:val="3"/>
         </w:numPr>
-        <w:spacing w:after="50"/>
+        <w:spacing w:after="100"/>
+        <w:jc w:val="both"/>
+        <w:rPr>
+          <w:sz w:val="22"/>
+          <w:szCs w:val="22"/>
+        </w:rPr>
       </w:pPr>
       <w:r>
         <w:rPr>
           <w:b/>
           <w:bCs/>
-          <w:sz w:val="19"/>
-          <w:szCs w:val="19"/>
-        </w:rPr>
-        <w:t xml:space="preserve">Gramatica de graficos: </w:t>
-      </w:r>
-      <w:r>
-        <w:rPr>
-          <w:sz w:val="19"/>
-          <w:szCs w:val="19"/>
-        </w:rPr>
-        <w:t>Uso sistematico de encodings (posicion, color, tamano) siguiendo la jerarquia de efectividad perceptual.</w:t>
+          <w:sz w:val="22"/>
+          <w:szCs w:val="22"/>
+        </w:rPr>
+        <w:t>Interactividad:</w:t>
+      </w:r>
+      <w:r>
+        <w:rPr>
+          <w:sz w:val="22"/>
+          <w:szCs w:val="22"/>
+        </w:rPr>
+        <w:t xml:space="preserve"> incorporación de </w:t>
+      </w:r>
+      <w:proofErr w:type="spellStart"/>
+      <w:r>
+        <w:rPr>
+          <w:sz w:val="22"/>
+          <w:szCs w:val="22"/>
+        </w:rPr>
+        <w:t>tooltips</w:t>
+      </w:r>
+      <w:proofErr w:type="spellEnd"/>
+      <w:r>
+        <w:rPr>
+          <w:sz w:val="22"/>
+          <w:szCs w:val="22"/>
+        </w:rPr>
+        <w:t xml:space="preserve">, selecciones y filtros </w:t>
+      </w:r>
+      <w:r>
+        <w:rPr>
+          <w:sz w:val="22"/>
+          <w:szCs w:val="22"/>
+        </w:rPr>
+        <w:t>q</w:t>
+      </w:r>
+      <w:r>
+        <w:rPr>
+          <w:sz w:val="22"/>
+          <w:szCs w:val="22"/>
+        </w:rPr>
+        <w:t>ue faciliten una exploración iterativa y dinámica de la información.</w:t>
       </w:r>
     </w:p>
     <w:p>
@@ -1961,25 +3636,55 @@
         <w:pStyle w:val="Prrafodelista"/>
         <w:numPr>
           <w:ilvl w:val="0"/>
-          <w:numId w:val="2"/>
+          <w:numId w:val="3"/>
         </w:numPr>
-        <w:spacing w:after="50"/>
+        <w:spacing w:after="100"/>
+        <w:jc w:val="both"/>
+        <w:rPr>
+          <w:sz w:val="22"/>
+          <w:szCs w:val="22"/>
+        </w:rPr>
       </w:pPr>
       <w:r>
         <w:rPr>
           <w:b/>
           <w:bCs/>
-          <w:sz w:val="19"/>
-          <w:szCs w:val="19"/>
-        </w:rPr>
-        <w:t xml:space="preserve">Interactividad: </w:t>
-      </w:r>
-      <w:r>
-        <w:rPr>
-          <w:sz w:val="19"/>
-          <w:szCs w:val="19"/>
-        </w:rPr>
-        <w:t>Tooltips, selecciones y filtros en Altair para exploracion iterativa.</w:t>
+          <w:sz w:val="22"/>
+          <w:szCs w:val="22"/>
+        </w:rPr>
+        <w:t>Tema personalizado:</w:t>
+      </w:r>
+      <w:r>
+        <w:rPr>
+          <w:sz w:val="22"/>
+          <w:szCs w:val="22"/>
+        </w:rPr>
+        <w:t xml:space="preserve"> diseño de estilos visuales orientados a resaltar los resultados más relevantes sin generar sobrecarga cognitiva en el usuario.</w:t>
+      </w:r>
+    </w:p>
+    <w:p>
+      <w:pPr>
+        <w:spacing w:after="100"/>
+        <w:jc w:val="both"/>
+        <w:rPr>
+          <w:sz w:val="22"/>
+          <w:szCs w:val="22"/>
+        </w:rPr>
+      </w:pPr>
+      <w:r>
+        <w:rPr>
+          <w:sz w:val="22"/>
+          <w:szCs w:val="22"/>
+        </w:rPr>
+        <w:t>Una vez seleccionadas las visualizaciones y definida una narrativa que permita comunicar de forma efectiva la “historia de los datos”, se procederá a la carga de la información en una herramienta de construcción de tableros dinámicos como Power BI. En esta etapa se abordarán aspectos de diseño tales como la estructura del tablero, títulos, filtros, número de páginas, paleta de colores, disposición de los elementos visuales y coherencia comunicativa, con el propósito de establecer un diálogo claro e intuitivo entre los gráficos y el usuario.</w:t>
+      </w:r>
+    </w:p>
+    <w:p>
+      <w:pPr>
+        <w:pStyle w:val="Ttulo1"/>
+      </w:pPr>
+      <w:r>
+        <w:t>Referencias</w:t>
       </w:r>
     </w:p>
     <w:p>
@@ -1987,92 +3692,121 @@
         <w:pStyle w:val="Prrafodelista"/>
         <w:numPr>
           <w:ilvl w:val="0"/>
-          <w:numId w:val="2"/>
+          <w:numId w:val="4"/>
         </w:numPr>
-        <w:spacing w:after="100"/>
-      </w:pPr>
-      <w:r>
-        <w:rPr>
-          <w:b/>
-          <w:bCs/>
-          <w:sz w:val="19"/>
-          <w:szCs w:val="19"/>
-        </w:rPr>
-        <w:t xml:space="preserve">Tema personalizado: </w:t>
-      </w:r>
-      <w:r>
-        <w:rPr>
-          <w:sz w:val="19"/>
-          <w:szCs w:val="19"/>
-        </w:rPr>
-        <w:t>Siguiendo el patron de temas custom de Altair trabajado en la Sesion 3.</w:t>
+        <w:spacing w:after="30"/>
+      </w:pPr>
+      <w:r>
+        <w:rPr>
+          <w:sz w:val="17"/>
+          <w:szCs w:val="17"/>
+        </w:rPr>
+        <w:t xml:space="preserve">World </w:t>
+      </w:r>
+      <w:proofErr w:type="spellStart"/>
+      <w:r>
+        <w:rPr>
+          <w:sz w:val="17"/>
+          <w:szCs w:val="17"/>
+        </w:rPr>
+        <w:t>Food</w:t>
+      </w:r>
+      <w:proofErr w:type="spellEnd"/>
+      <w:r>
+        <w:rPr>
+          <w:sz w:val="17"/>
+          <w:szCs w:val="17"/>
+        </w:rPr>
+        <w:t xml:space="preserve"> </w:t>
+      </w:r>
+      <w:proofErr w:type="spellStart"/>
+      <w:r>
+        <w:rPr>
+          <w:sz w:val="17"/>
+          <w:szCs w:val="17"/>
+        </w:rPr>
+        <w:t>Programme</w:t>
+      </w:r>
+      <w:proofErr w:type="spellEnd"/>
+      <w:r>
+        <w:rPr>
+          <w:sz w:val="17"/>
+          <w:szCs w:val="17"/>
+        </w:rPr>
+        <w:t xml:space="preserve">. WFP </w:t>
+      </w:r>
+      <w:proofErr w:type="spellStart"/>
+      <w:r>
+        <w:rPr>
+          <w:sz w:val="17"/>
+          <w:szCs w:val="17"/>
+        </w:rPr>
+        <w:t>Food</w:t>
+      </w:r>
+      <w:proofErr w:type="spellEnd"/>
+      <w:r>
+        <w:rPr>
+          <w:sz w:val="17"/>
+          <w:szCs w:val="17"/>
+        </w:rPr>
+        <w:t xml:space="preserve"> </w:t>
+      </w:r>
+      <w:proofErr w:type="spellStart"/>
+      <w:r>
+        <w:rPr>
+          <w:sz w:val="17"/>
+          <w:szCs w:val="17"/>
+        </w:rPr>
+        <w:t>Prices</w:t>
+      </w:r>
+      <w:proofErr w:type="spellEnd"/>
+      <w:r>
+        <w:rPr>
+          <w:sz w:val="17"/>
+          <w:szCs w:val="17"/>
+        </w:rPr>
+        <w:t xml:space="preserve"> </w:t>
+      </w:r>
+      <w:proofErr w:type="spellStart"/>
+      <w:r>
+        <w:rPr>
+          <w:sz w:val="17"/>
+          <w:szCs w:val="17"/>
+        </w:rPr>
+        <w:t>for</w:t>
+      </w:r>
+      <w:proofErr w:type="spellEnd"/>
+      <w:r>
+        <w:rPr>
+          <w:sz w:val="17"/>
+          <w:szCs w:val="17"/>
+        </w:rPr>
+        <w:t xml:space="preserve"> Colombia. </w:t>
+      </w:r>
+      <w:proofErr w:type="spellStart"/>
+      <w:r>
+        <w:rPr>
+          <w:sz w:val="17"/>
+          <w:szCs w:val="17"/>
+        </w:rPr>
+        <w:t>Humanitarian</w:t>
+      </w:r>
+      <w:proofErr w:type="spellEnd"/>
+      <w:r>
+        <w:rPr>
+          <w:sz w:val="17"/>
+          <w:szCs w:val="17"/>
+        </w:rPr>
+        <w:t xml:space="preserve"> Data Exchange. https://data.humdata.org/dataset/wfp-food-prices-for-colombia</w:t>
       </w:r>
     </w:p>
     <w:p>
       <w:pPr>
-        <w:spacing w:after="100"/>
-      </w:pPr>
-    </w:p>
-    <w:p>
-      <w:pPr>
-        <w:spacing w:after="100"/>
-      </w:pPr>
-    </w:p>
-    <w:p>
-      <w:pPr>
-        <w:spacing w:after="100"/>
-      </w:pPr>
-    </w:p>
-    <w:p>
-      <w:pPr>
-        <w:pStyle w:val="Ttulo2"/>
-        <w:pBdr>
-          <w:top w:val="single" w:sz="2" w:space="6" w:color="CCCCCC"/>
-        </w:pBdr>
-        <w:spacing w:before="120"/>
-      </w:pPr>
-    </w:p>
-    <w:p>
-      <w:pPr>
-        <w:pStyle w:val="Ttulo2"/>
-        <w:pBdr>
-          <w:top w:val="single" w:sz="2" w:space="6" w:color="CCCCCC"/>
-        </w:pBdr>
-        <w:spacing w:before="120"/>
-      </w:pPr>
-    </w:p>
-    <w:p>
-      <w:pPr>
-        <w:pStyle w:val="Ttulo2"/>
-        <w:pBdr>
-          <w:top w:val="single" w:sz="2" w:space="6" w:color="CCCCCC"/>
-        </w:pBdr>
-        <w:spacing w:before="120"/>
-      </w:pPr>
-    </w:p>
-    <w:p>
-      <w:pPr>
-        <w:pStyle w:val="Ttulo2"/>
-        <w:pBdr>
-          <w:top w:val="single" w:sz="2" w:space="6" w:color="CCCCCC"/>
-        </w:pBdr>
-        <w:spacing w:before="120"/>
-      </w:pPr>
-    </w:p>
-    <w:p>
-      <w:pPr>
-        <w:pStyle w:val="Ttulo2"/>
-        <w:pBdr>
-          <w:top w:val="single" w:sz="2" w:space="6" w:color="CCCCCC"/>
-        </w:pBdr>
-        <w:spacing w:before="120"/>
-      </w:pPr>
-      <w:r>
-        <w:t>Referencias</w:t>
-      </w:r>
-    </w:p>
-    <w:p>
-      <w:pPr>
+        <w:pStyle w:val="Prrafodelista"/>
+        <w:numPr>
+          <w:ilvl w:val="0"/>
+          <w:numId w:val="4"/>
+        </w:numPr>
         <w:spacing w:after="30"/>
       </w:pPr>
       <w:r>
@@ -2080,43 +3814,35 @@
           <w:sz w:val="17"/>
           <w:szCs w:val="17"/>
         </w:rPr>
-        <w:t>World Food Programme. WFP Food Prices for Colombia. Humanitarian Data Exchange. https://data.humdata.org/dataset/wfp-food-prices-for-colombia</w:t>
-      </w:r>
-    </w:p>
-    <w:p>
-      <w:pPr>
-        <w:spacing w:after="30"/>
-      </w:pPr>
+        <w:t xml:space="preserve">Material del curso: </w:t>
+      </w:r>
       <w:r>
         <w:rPr>
           <w:sz w:val="17"/>
           <w:szCs w:val="17"/>
         </w:rPr>
-        <w:t>Tufte, E. R. (2001). The Visual Display of Quantitative Information. Graphics Press.</w:t>
-      </w:r>
-    </w:p>
-    <w:p>
-      <w:pPr>
-        <w:spacing w:after="30"/>
-      </w:pPr>
+        <w:t>Visualización</w:t>
+      </w:r>
       <w:r>
         <w:rPr>
           <w:sz w:val="17"/>
           <w:szCs w:val="17"/>
         </w:rPr>
-        <w:t>VanderPlas, J. et al. (2018). Altair: Interactive Statistical Visualizations for Python. JOSS.</w:t>
-      </w:r>
-    </w:p>
-    <w:p>
-      <w:pPr>
-        <w:spacing w:after="30"/>
-      </w:pPr>
+        <w:t xml:space="preserve"> de Datos. Universidad </w:t>
+      </w:r>
       <w:r>
         <w:rPr>
           <w:sz w:val="17"/>
           <w:szCs w:val="17"/>
         </w:rPr>
-        <w:t>Material del curso: Visualizacion de Datos. Universidad Autonoma de Occidente, 2026.</w:t>
+        <w:t>Autónoma</w:t>
+      </w:r>
+      <w:r>
+        <w:rPr>
+          <w:sz w:val="17"/>
+          <w:szCs w:val="17"/>
+        </w:rPr>
+        <w:t xml:space="preserve"> de Occidente, 2026.</w:t>
       </w:r>
     </w:p>
     <w:sectPr>
@@ -2159,13 +3885,23 @@
       </w:pBdr>
       <w:jc w:val="center"/>
     </w:pPr>
+    <w:proofErr w:type="spellStart"/>
     <w:r>
       <w:rPr>
         <w:color w:val="888888"/>
         <w:sz w:val="16"/>
         <w:szCs w:val="16"/>
       </w:rPr>
-      <w:t xml:space="preserve">Pagina </w:t>
+      <w:t>Pagina</w:t>
+    </w:r>
+    <w:proofErr w:type="spellEnd"/>
+    <w:r>
+      <w:rPr>
+        <w:color w:val="888888"/>
+        <w:sz w:val="16"/>
+        <w:szCs w:val="16"/>
+      </w:rPr>
+      <w:t xml:space="preserve"> </w:t>
     </w:r>
     <w:r>
       <w:rPr>
@@ -2193,7 +3929,6 @@
     </w:r>
     <w:r>
       <w:rPr>
-        <w:noProof/>
         <w:color w:val="888888"/>
         <w:sz w:val="16"/>
         <w:szCs w:val="16"/>
@@ -2242,7 +3977,6 @@
     </w:r>
     <w:r>
       <w:rPr>
-        <w:noProof/>
         <w:color w:val="888888"/>
         <w:sz w:val="16"/>
         <w:szCs w:val="16"/>
@@ -2299,7 +4033,27 @@
         <w:sz w:val="16"/>
         <w:szCs w:val="16"/>
       </w:rPr>
-      <w:t>Proyecto Final — Visualizacion de Datos</w:t>
+      <w:t xml:space="preserve">Proyecto Final — </w:t>
+    </w:r>
+    <w:r>
+      <w:rPr>
+        <w:i/>
+        <w:iCs/>
+        <w:color w:val="888888"/>
+        <w:sz w:val="16"/>
+        <w:szCs w:val="16"/>
+      </w:rPr>
+      <w:t>Visualización</w:t>
+    </w:r>
+    <w:r>
+      <w:rPr>
+        <w:i/>
+        <w:iCs/>
+        <w:color w:val="888888"/>
+        <w:sz w:val="16"/>
+        <w:szCs w:val="16"/>
+      </w:rPr>
+      <w:t xml:space="preserve"> de Datos</w:t>
     </w:r>
     <w:r>
       <w:rPr>
@@ -2310,7 +4064,27 @@
         <w:szCs w:val="16"/>
       </w:rPr>
       <w:tab/>
-      <w:t>Universidad Autonoma de Occidente</w:t>
+      <w:t xml:space="preserve">Universidad </w:t>
+    </w:r>
+    <w:r>
+      <w:rPr>
+        <w:i/>
+        <w:iCs/>
+        <w:color w:val="888888"/>
+        <w:sz w:val="16"/>
+        <w:szCs w:val="16"/>
+      </w:rPr>
+      <w:t>Autónoma</w:t>
+    </w:r>
+    <w:r>
+      <w:rPr>
+        <w:i/>
+        <w:iCs/>
+        <w:color w:val="888888"/>
+        <w:sz w:val="16"/>
+        <w:szCs w:val="16"/>
+      </w:rPr>
+      <w:t xml:space="preserve"> de Occidente</w:t>
     </w:r>
   </w:p>
 </w:hdr>
@@ -2319,6 +4093,345 @@
 <file path=word/numbering.xml><?xml version="1.0" encoding="utf-8"?>
 <w:numbering xmlns:wpc="http://schemas.microsoft.com/office/word/2010/wordprocessingCanvas" xmlns:cx="http://schemas.microsoft.com/office/drawing/2014/chartex" xmlns:cx1="http://schemas.microsoft.com/office/drawing/2015/9/8/chartex" xmlns:cx2="http://schemas.microsoft.com/office/drawing/2015/10/21/chartex" xmlns:cx3="http://schemas.microsoft.com/office/drawing/2016/5/9/chartex" xmlns:cx4="http://schemas.microsoft.com/office/drawing/2016/5/10/chartex" xmlns:cx5="http://schemas.microsoft.com/office/drawing/2016/5/11/chartex" xmlns:cx6="http://schemas.microsoft.com/office/drawing/2016/5/12/chartex" xmlns:cx7="http://schemas.microsoft.com/office/drawing/2016/5/13/chartex" xmlns:cx8="http://schemas.microsoft.com/office/drawing/2016/5/14/chartex" xmlns:mc="http://schemas.openxmlformats.org/markup-compatibility/2006" xmlns:aink="http://schemas.microsoft.com/office/drawing/2016/ink" xmlns:am3d="http://schemas.microsoft.com/office/drawing/2017/model3d" xmlns:o="urn:schemas-microsoft-com:office:office" xmlns:oel="http://schemas.microsoft.com/office/2019/extlst" xmlns:r="http://schemas.openxmlformats.org/officeDocument/2006/relationships" xmlns:m="http://schemas.openxmlformats.org/officeDocument/2006/math" xmlns:v="urn:schemas-microsoft-com:vml" xmlns:wp14="http://schemas.microsoft.com/office/word/2010/wordprocessingDrawing" xmlns:wp="http://schemas.openxmlformats.org/drawingml/2006/wordprocessingDrawing" xmlns:w10="urn:schemas-microsoft-com:office:word" xmlns:w="http://schemas.openxmlformats.org/wordprocessingml/2006/main" xmlns:w14="http://schemas.microsoft.com/office/word/2010/wordml" xmlns:w15="http://schemas.microsoft.com/office/word/2012/wordml" xmlns:w16cex="http://schemas.microsoft.com/office/word/2018/wordml/cex" xmlns:w16cid="http://schemas.microsoft.com/office/word/2016/wordml/cid" xmlns:w16="http://schemas.microsoft.com/office/word/2018/wordml" xmlns:w16du="http://schemas.microsoft.com/office/word/2023/wordml/word16du" xmlns:w16sdtdh="http://schemas.microsoft.com/office/word/2020/wordml/sdtdatahash" xmlns:w16sdtfl="http://schemas.microsoft.com/office/word/2024/wordml/sdtformatlock" xmlns:w16se="http://schemas.microsoft.com/office/word/2015/wordml/symex" xmlns:wpg="http://schemas.microsoft.com/office/word/2010/wordprocessingGroup" xmlns:wpi="http://schemas.microsoft.com/office/word/2010/wordprocessingInk" xmlns:wne="http://schemas.microsoft.com/office/word/2006/wordml" xmlns:wps="http://schemas.microsoft.com/office/word/2010/wordprocessingShape" mc:Ignorable="w14 w15 w16se w16cid w16 w16cex w16sdtdh w16sdtfl w16du wp14">
   <w:abstractNum w:abstractNumId="0" w15:restartNumberingAfterBreak="0">
+    <w:nsid w:val="05216B8D"/>
+    <w:multiLevelType w:val="hybridMultilevel"/>
+    <w:tmpl w:val="96E8A696"/>
+    <w:lvl w:ilvl="0" w:tplc="F498024A">
+      <w:start w:val="6"/>
+      <w:numFmt w:val="bullet"/>
+      <w:lvlText w:val=""/>
+      <w:lvlJc w:val="left"/>
+      <w:pPr>
+        <w:ind w:left="720" w:hanging="360"/>
+      </w:pPr>
+      <w:rPr>
+        <w:rFonts w:ascii="Symbol" w:eastAsia="Arial" w:hAnsi="Symbol" w:cs="Arial" w:hint="default"/>
+      </w:rPr>
+    </w:lvl>
+    <w:lvl w:ilvl="1" w:tplc="240A0003" w:tentative="1">
+      <w:start w:val="1"/>
+      <w:numFmt w:val="bullet"/>
+      <w:lvlText w:val="o"/>
+      <w:lvlJc w:val="left"/>
+      <w:pPr>
+        <w:ind w:left="1440" w:hanging="360"/>
+      </w:pPr>
+      <w:rPr>
+        <w:rFonts w:ascii="Courier New" w:hAnsi="Courier New" w:cs="Courier New" w:hint="default"/>
+      </w:rPr>
+    </w:lvl>
+    <w:lvl w:ilvl="2" w:tplc="240A0005" w:tentative="1">
+      <w:start w:val="1"/>
+      <w:numFmt w:val="bullet"/>
+      <w:lvlText w:val=""/>
+      <w:lvlJc w:val="left"/>
+      <w:pPr>
+        <w:ind w:left="2160" w:hanging="360"/>
+      </w:pPr>
+      <w:rPr>
+        <w:rFonts w:ascii="Wingdings" w:hAnsi="Wingdings" w:hint="default"/>
+      </w:rPr>
+    </w:lvl>
+    <w:lvl w:ilvl="3" w:tplc="240A0001" w:tentative="1">
+      <w:start w:val="1"/>
+      <w:numFmt w:val="bullet"/>
+      <w:lvlText w:val=""/>
+      <w:lvlJc w:val="left"/>
+      <w:pPr>
+        <w:ind w:left="2880" w:hanging="360"/>
+      </w:pPr>
+      <w:rPr>
+        <w:rFonts w:ascii="Symbol" w:hAnsi="Symbol" w:hint="default"/>
+      </w:rPr>
+    </w:lvl>
+    <w:lvl w:ilvl="4" w:tplc="240A0003" w:tentative="1">
+      <w:start w:val="1"/>
+      <w:numFmt w:val="bullet"/>
+      <w:lvlText w:val="o"/>
+      <w:lvlJc w:val="left"/>
+      <w:pPr>
+        <w:ind w:left="3600" w:hanging="360"/>
+      </w:pPr>
+      <w:rPr>
+        <w:rFonts w:ascii="Courier New" w:hAnsi="Courier New" w:cs="Courier New" w:hint="default"/>
+      </w:rPr>
+    </w:lvl>
+    <w:lvl w:ilvl="5" w:tplc="240A0005" w:tentative="1">
+      <w:start w:val="1"/>
+      <w:numFmt w:val="bullet"/>
+      <w:lvlText w:val=""/>
+      <w:lvlJc w:val="left"/>
+      <w:pPr>
+        <w:ind w:left="4320" w:hanging="360"/>
+      </w:pPr>
+      <w:rPr>
+        <w:rFonts w:ascii="Wingdings" w:hAnsi="Wingdings" w:hint="default"/>
+      </w:rPr>
+    </w:lvl>
+    <w:lvl w:ilvl="6" w:tplc="240A0001" w:tentative="1">
+      <w:start w:val="1"/>
+      <w:numFmt w:val="bullet"/>
+      <w:lvlText w:val=""/>
+      <w:lvlJc w:val="left"/>
+      <w:pPr>
+        <w:ind w:left="5040" w:hanging="360"/>
+      </w:pPr>
+      <w:rPr>
+        <w:rFonts w:ascii="Symbol" w:hAnsi="Symbol" w:hint="default"/>
+      </w:rPr>
+    </w:lvl>
+    <w:lvl w:ilvl="7" w:tplc="240A0003" w:tentative="1">
+      <w:start w:val="1"/>
+      <w:numFmt w:val="bullet"/>
+      <w:lvlText w:val="o"/>
+      <w:lvlJc w:val="left"/>
+      <w:pPr>
+        <w:ind w:left="5760" w:hanging="360"/>
+      </w:pPr>
+      <w:rPr>
+        <w:rFonts w:ascii="Courier New" w:hAnsi="Courier New" w:cs="Courier New" w:hint="default"/>
+      </w:rPr>
+    </w:lvl>
+    <w:lvl w:ilvl="8" w:tplc="240A0005" w:tentative="1">
+      <w:start w:val="1"/>
+      <w:numFmt w:val="bullet"/>
+      <w:lvlText w:val=""/>
+      <w:lvlJc w:val="left"/>
+      <w:pPr>
+        <w:ind w:left="6480" w:hanging="360"/>
+      </w:pPr>
+      <w:rPr>
+        <w:rFonts w:ascii="Wingdings" w:hAnsi="Wingdings" w:hint="default"/>
+      </w:rPr>
+    </w:lvl>
+  </w:abstractNum>
+  <w:abstractNum w:abstractNumId="1" w15:restartNumberingAfterBreak="0">
+    <w:nsid w:val="30126158"/>
+    <w:multiLevelType w:val="hybridMultilevel"/>
+    <w:tmpl w:val="4CAA97F0"/>
+    <w:lvl w:ilvl="0" w:tplc="F498024A">
+      <w:start w:val="6"/>
+      <w:numFmt w:val="bullet"/>
+      <w:lvlText w:val=""/>
+      <w:lvlJc w:val="left"/>
+      <w:pPr>
+        <w:ind w:left="720" w:hanging="360"/>
+      </w:pPr>
+      <w:rPr>
+        <w:rFonts w:ascii="Symbol" w:eastAsia="Arial" w:hAnsi="Symbol" w:cs="Arial" w:hint="default"/>
+      </w:rPr>
+    </w:lvl>
+    <w:lvl w:ilvl="1" w:tplc="240A0003" w:tentative="1">
+      <w:start w:val="1"/>
+      <w:numFmt w:val="bullet"/>
+      <w:lvlText w:val="o"/>
+      <w:lvlJc w:val="left"/>
+      <w:pPr>
+        <w:ind w:left="1440" w:hanging="360"/>
+      </w:pPr>
+      <w:rPr>
+        <w:rFonts w:ascii="Courier New" w:hAnsi="Courier New" w:cs="Courier New" w:hint="default"/>
+      </w:rPr>
+    </w:lvl>
+    <w:lvl w:ilvl="2" w:tplc="240A0005" w:tentative="1">
+      <w:start w:val="1"/>
+      <w:numFmt w:val="bullet"/>
+      <w:lvlText w:val=""/>
+      <w:lvlJc w:val="left"/>
+      <w:pPr>
+        <w:ind w:left="2160" w:hanging="360"/>
+      </w:pPr>
+      <w:rPr>
+        <w:rFonts w:ascii="Wingdings" w:hAnsi="Wingdings" w:hint="default"/>
+      </w:rPr>
+    </w:lvl>
+    <w:lvl w:ilvl="3" w:tplc="240A0001" w:tentative="1">
+      <w:start w:val="1"/>
+      <w:numFmt w:val="bullet"/>
+      <w:lvlText w:val=""/>
+      <w:lvlJc w:val="left"/>
+      <w:pPr>
+        <w:ind w:left="2880" w:hanging="360"/>
+      </w:pPr>
+      <w:rPr>
+        <w:rFonts w:ascii="Symbol" w:hAnsi="Symbol" w:hint="default"/>
+      </w:rPr>
+    </w:lvl>
+    <w:lvl w:ilvl="4" w:tplc="240A0003" w:tentative="1">
+      <w:start w:val="1"/>
+      <w:numFmt w:val="bullet"/>
+      <w:lvlText w:val="o"/>
+      <w:lvlJc w:val="left"/>
+      <w:pPr>
+        <w:ind w:left="3600" w:hanging="360"/>
+      </w:pPr>
+      <w:rPr>
+        <w:rFonts w:ascii="Courier New" w:hAnsi="Courier New" w:cs="Courier New" w:hint="default"/>
+      </w:rPr>
+    </w:lvl>
+    <w:lvl w:ilvl="5" w:tplc="240A0005" w:tentative="1">
+      <w:start w:val="1"/>
+      <w:numFmt w:val="bullet"/>
+      <w:lvlText w:val=""/>
+      <w:lvlJc w:val="left"/>
+      <w:pPr>
+        <w:ind w:left="4320" w:hanging="360"/>
+      </w:pPr>
+      <w:rPr>
+        <w:rFonts w:ascii="Wingdings" w:hAnsi="Wingdings" w:hint="default"/>
+      </w:rPr>
+    </w:lvl>
+    <w:lvl w:ilvl="6" w:tplc="240A0001" w:tentative="1">
+      <w:start w:val="1"/>
+      <w:numFmt w:val="bullet"/>
+      <w:lvlText w:val=""/>
+      <w:lvlJc w:val="left"/>
+      <w:pPr>
+        <w:ind w:left="5040" w:hanging="360"/>
+      </w:pPr>
+      <w:rPr>
+        <w:rFonts w:ascii="Symbol" w:hAnsi="Symbol" w:hint="default"/>
+      </w:rPr>
+    </w:lvl>
+    <w:lvl w:ilvl="7" w:tplc="240A0003" w:tentative="1">
+      <w:start w:val="1"/>
+      <w:numFmt w:val="bullet"/>
+      <w:lvlText w:val="o"/>
+      <w:lvlJc w:val="left"/>
+      <w:pPr>
+        <w:ind w:left="5760" w:hanging="360"/>
+      </w:pPr>
+      <w:rPr>
+        <w:rFonts w:ascii="Courier New" w:hAnsi="Courier New" w:cs="Courier New" w:hint="default"/>
+      </w:rPr>
+    </w:lvl>
+    <w:lvl w:ilvl="8" w:tplc="240A0005" w:tentative="1">
+      <w:start w:val="1"/>
+      <w:numFmt w:val="bullet"/>
+      <w:lvlText w:val=""/>
+      <w:lvlJc w:val="left"/>
+      <w:pPr>
+        <w:ind w:left="6480" w:hanging="360"/>
+      </w:pPr>
+      <w:rPr>
+        <w:rFonts w:ascii="Wingdings" w:hAnsi="Wingdings" w:hint="default"/>
+      </w:rPr>
+    </w:lvl>
+  </w:abstractNum>
+  <w:abstractNum w:abstractNumId="2" w15:restartNumberingAfterBreak="0">
+    <w:nsid w:val="4ACA7801"/>
+    <w:multiLevelType w:val="hybridMultilevel"/>
+    <w:tmpl w:val="381E3852"/>
+    <w:lvl w:ilvl="0" w:tplc="F498024A">
+      <w:start w:val="6"/>
+      <w:numFmt w:val="bullet"/>
+      <w:lvlText w:val=""/>
+      <w:lvlJc w:val="left"/>
+      <w:pPr>
+        <w:ind w:left="720" w:hanging="360"/>
+      </w:pPr>
+      <w:rPr>
+        <w:rFonts w:ascii="Symbol" w:eastAsia="Arial" w:hAnsi="Symbol" w:cs="Arial" w:hint="default"/>
+      </w:rPr>
+    </w:lvl>
+    <w:lvl w:ilvl="1" w:tplc="240A0003" w:tentative="1">
+      <w:start w:val="1"/>
+      <w:numFmt w:val="bullet"/>
+      <w:lvlText w:val="o"/>
+      <w:lvlJc w:val="left"/>
+      <w:pPr>
+        <w:ind w:left="1440" w:hanging="360"/>
+      </w:pPr>
+      <w:rPr>
+        <w:rFonts w:ascii="Courier New" w:hAnsi="Courier New" w:cs="Courier New" w:hint="default"/>
+      </w:rPr>
+    </w:lvl>
+    <w:lvl w:ilvl="2" w:tplc="240A0005" w:tentative="1">
+      <w:start w:val="1"/>
+      <w:numFmt w:val="bullet"/>
+      <w:lvlText w:val=""/>
+      <w:lvlJc w:val="left"/>
+      <w:pPr>
+        <w:ind w:left="2160" w:hanging="360"/>
+      </w:pPr>
+      <w:rPr>
+        <w:rFonts w:ascii="Wingdings" w:hAnsi="Wingdings" w:hint="default"/>
+      </w:rPr>
+    </w:lvl>
+    <w:lvl w:ilvl="3" w:tplc="240A0001" w:tentative="1">
+      <w:start w:val="1"/>
+      <w:numFmt w:val="bullet"/>
+      <w:lvlText w:val=""/>
+      <w:lvlJc w:val="left"/>
+      <w:pPr>
+        <w:ind w:left="2880" w:hanging="360"/>
+      </w:pPr>
+      <w:rPr>
+        <w:rFonts w:ascii="Symbol" w:hAnsi="Symbol" w:hint="default"/>
+      </w:rPr>
+    </w:lvl>
+    <w:lvl w:ilvl="4" w:tplc="240A0003" w:tentative="1">
+      <w:start w:val="1"/>
+      <w:numFmt w:val="bullet"/>
+      <w:lvlText w:val="o"/>
+      <w:lvlJc w:val="left"/>
+      <w:pPr>
+        <w:ind w:left="3600" w:hanging="360"/>
+      </w:pPr>
+      <w:rPr>
+        <w:rFonts w:ascii="Courier New" w:hAnsi="Courier New" w:cs="Courier New" w:hint="default"/>
+      </w:rPr>
+    </w:lvl>
+    <w:lvl w:ilvl="5" w:tplc="240A0005" w:tentative="1">
+      <w:start w:val="1"/>
+      <w:numFmt w:val="bullet"/>
+      <w:lvlText w:val=""/>
+      <w:lvlJc w:val="left"/>
+      <w:pPr>
+        <w:ind w:left="4320" w:hanging="360"/>
+      </w:pPr>
+      <w:rPr>
+        <w:rFonts w:ascii="Wingdings" w:hAnsi="Wingdings" w:hint="default"/>
+      </w:rPr>
+    </w:lvl>
+    <w:lvl w:ilvl="6" w:tplc="240A0001" w:tentative="1">
+      <w:start w:val="1"/>
+      <w:numFmt w:val="bullet"/>
+      <w:lvlText w:val=""/>
+      <w:lvlJc w:val="left"/>
+      <w:pPr>
+        <w:ind w:left="5040" w:hanging="360"/>
+      </w:pPr>
+      <w:rPr>
+        <w:rFonts w:ascii="Symbol" w:hAnsi="Symbol" w:hint="default"/>
+      </w:rPr>
+    </w:lvl>
+    <w:lvl w:ilvl="7" w:tplc="240A0003" w:tentative="1">
+      <w:start w:val="1"/>
+      <w:numFmt w:val="bullet"/>
+      <w:lvlText w:val="o"/>
+      <w:lvlJc w:val="left"/>
+      <w:pPr>
+        <w:ind w:left="5760" w:hanging="360"/>
+      </w:pPr>
+      <w:rPr>
+        <w:rFonts w:ascii="Courier New" w:hAnsi="Courier New" w:cs="Courier New" w:hint="default"/>
+      </w:rPr>
+    </w:lvl>
+    <w:lvl w:ilvl="8" w:tplc="240A0005" w:tentative="1">
+      <w:start w:val="1"/>
+      <w:numFmt w:val="bullet"/>
+      <w:lvlText w:val=""/>
+      <w:lvlJc w:val="left"/>
+      <w:pPr>
+        <w:ind w:left="6480" w:hanging="360"/>
+      </w:pPr>
+      <w:rPr>
+        <w:rFonts w:ascii="Wingdings" w:hAnsi="Wingdings" w:hint="default"/>
+      </w:rPr>
+    </w:lvl>
+  </w:abstractNum>
+  <w:abstractNum w:abstractNumId="3" w15:restartNumberingAfterBreak="0">
     <w:nsid w:val="6A260D27"/>
     <w:multiLevelType w:val="hybridMultilevel"/>
     <w:tmpl w:val="7E5E5BFE"/>
@@ -2404,7 +4517,7 @@
       </w:pPr>
     </w:lvl>
   </w:abstractNum>
-  <w:abstractNum w:abstractNumId="1" w15:restartNumberingAfterBreak="0">
+  <w:abstractNum w:abstractNumId="4" w15:restartNumberingAfterBreak="0">
     <w:nsid w:val="744E305F"/>
     <w:multiLevelType w:val="hybridMultilevel"/>
     <w:tmpl w:val="D01697DC"/>
@@ -2459,16 +4572,25 @@
     </w:lvl>
   </w:abstractNum>
   <w:num w:numId="1" w16cid:durableId="705715102">
-    <w:abstractNumId w:val="0"/>
+    <w:abstractNumId w:val="3"/>
     <w:lvlOverride w:ilvl="0">
       <w:startOverride w:val="1"/>
     </w:lvlOverride>
   </w:num>
   <w:num w:numId="2" w16cid:durableId="1899632701">
-    <w:abstractNumId w:val="1"/>
+    <w:abstractNumId w:val="4"/>
     <w:lvlOverride w:ilvl="0">
       <w:startOverride w:val="1"/>
     </w:lvlOverride>
+  </w:num>
+  <w:num w:numId="3" w16cid:durableId="522942641">
+    <w:abstractNumId w:val="1"/>
+  </w:num>
+  <w:num w:numId="4" w16cid:durableId="1328561280">
+    <w:abstractNumId w:val="2"/>
+  </w:num>
+  <w:num w:numId="5" w16cid:durableId="492260009">
+    <w:abstractNumId w:val="0"/>
   </w:num>
 </w:numbering>
 </file>
@@ -2479,7 +4601,7 @@
     <w:rPrDefault>
       <w:rPr>
         <w:rFonts w:ascii="Arial" w:eastAsia="Arial" w:hAnsi="Arial" w:cs="Arial"/>
-        <w:lang w:eastAsia="en-US" w:bidi="ar-SA"/>
+        <w:lang w:val="es-CO" w:eastAsia="en-US" w:bidi="ar-SA"/>
       </w:rPr>
     </w:rPrDefault>
     <w:pPrDefault/>
@@ -2958,7 +5080,6 @@
   <w:style w:type="character" w:default="1" w:styleId="Fuentedeprrafopredeter">
     <w:name w:val="Default Paragraph Font"/>
     <w:uiPriority w:val="1"/>
-    <w:semiHidden/>
     <w:unhideWhenUsed/>
   </w:style>
   <w:style w:type="table" w:default="1" w:styleId="Tablanormal">
@@ -3038,6 +5159,48 @@
       <w:sz w:val="20"/>
       <w:szCs w:val="20"/>
     </w:rPr>
+  </w:style>
+  <w:style w:type="paragraph" w:styleId="Encabezado">
+    <w:name w:val="header"/>
+    <w:basedOn w:val="Normal"/>
+    <w:link w:val="EncabezadoCar"/>
+    <w:uiPriority w:val="99"/>
+    <w:unhideWhenUsed/>
+    <w:rsid w:val="0075438E"/>
+    <w:pPr>
+      <w:tabs>
+        <w:tab w:val="center" w:pos="4419"/>
+        <w:tab w:val="right" w:pos="8838"/>
+      </w:tabs>
+    </w:pPr>
+  </w:style>
+  <w:style w:type="character" w:customStyle="1" w:styleId="EncabezadoCar">
+    <w:name w:val="Encabezado Car"/>
+    <w:basedOn w:val="Fuentedeprrafopredeter"/>
+    <w:link w:val="Encabezado"/>
+    <w:uiPriority w:val="99"/>
+    <w:rsid w:val="0075438E"/>
+  </w:style>
+  <w:style w:type="paragraph" w:styleId="Piedepgina">
+    <w:name w:val="footer"/>
+    <w:basedOn w:val="Normal"/>
+    <w:link w:val="PiedepginaCar"/>
+    <w:uiPriority w:val="99"/>
+    <w:unhideWhenUsed/>
+    <w:rsid w:val="0075438E"/>
+    <w:pPr>
+      <w:tabs>
+        <w:tab w:val="center" w:pos="4419"/>
+        <w:tab w:val="right" w:pos="8838"/>
+      </w:tabs>
+    </w:pPr>
+  </w:style>
+  <w:style w:type="character" w:customStyle="1" w:styleId="PiedepginaCar">
+    <w:name w:val="Pie de página Car"/>
+    <w:basedOn w:val="Fuentedeprrafopredeter"/>
+    <w:link w:val="Piedepgina"/>
+    <w:uiPriority w:val="99"/>
+    <w:rsid w:val="0075438E"/>
   </w:style>
 </w:styles>
 </file>

</xml_diff>